<commit_message>
Added visualization part in research paper
</commit_message>
<xml_diff>
--- a/source/Documentation_Team_Untitled/Investigate_Input_Reconstruction_by_Using_Classifiers.docx
+++ b/source/Documentation_Team_Untitled/Investigate_Input_Reconstruction_by_Using_Classifiers.docx
@@ -101,8 +101,13 @@
         <w:br w:type="column"/>
       </w:r>
       <w:r>
-        <w:t>Manoj Hanumanthu</w:t>
-      </w:r>
+        <w:t xml:space="preserve">Manoj </w:t>
+      </w:r>
+      <w:proofErr w:type="spellStart"/>
+      <w:r>
+        <w:t>Hanumanthu</w:t>
+      </w:r>
+      <w:proofErr w:type="spellEnd"/>
       <w:r>
         <w:rPr>
           <w:sz w:val="18"/>
@@ -251,7 +256,37 @@
           <w:szCs w:val="18"/>
           <w14:ligatures w14:val="standardContextual"/>
         </w:rPr>
-        <w:t xml:space="preserve"> reconstruction plays a crucial role in neural encoding and pattern recognition, enabling efficient data processing and predictive modeling. This study investigates the use of Hierarchical Temporal Memory (HTM) and K-Nearest Neighbors (KNN) classifiers to reconstruct encoded inputs. Using the NeocortexAPI, we encode input arrays and train a spatial pooler to generate Sparse Distributed Representations (SDRs). The dataset is divided into training and testing subsets, with classifiers trained on the training data and evaluated on the test set. The encoded test data is decoded using HTM and KNN, and the reconstructed values are compared to the original input using similarity metrics, including internal similarity and percentage similarity. Results, visualized with the ScottPlot library in .NET, demonstrate that both classifiers achieve high accuracy in reconstructing input patterns. This research highlights the potential of HTM and KNN in sparse encoding-based input reconstruction, with applications in anomaly detection, data compression, and predictive modeling. Our findings contribute to advancing machine learning techniques that leverage sparse distributed representations for improved classification and reconstruction accuracy.</w:t>
+        <w:t xml:space="preserve"> reconstruction plays a crucial role in neural encoding and pattern recognition, enabling efficient data processing and predictive modeling. This study investigates the use of Hierarchical Temporal Memory (HTM) and K-Nearest Neighbors (KNN) classifiers to reconstruct encoded inputs. Using the </w:t>
+      </w:r>
+      <w:proofErr w:type="spellStart"/>
+      <w:r>
+        <w:rPr>
+          <w:rFonts w:eastAsiaTheme="minorHAnsi"/>
+          <w:b/>
+          <w:bCs/>
+          <w:i/>
+          <w:iCs/>
+          <w:kern w:val="2"/>
+          <w:sz w:val="18"/>
+          <w:szCs w:val="18"/>
+          <w14:ligatures w14:val="standardContextual"/>
+        </w:rPr>
+        <w:t>NeocortexAPI</w:t>
+      </w:r>
+      <w:proofErr w:type="spellEnd"/>
+      <w:r>
+        <w:rPr>
+          <w:rFonts w:eastAsiaTheme="minorHAnsi"/>
+          <w:b/>
+          <w:bCs/>
+          <w:i/>
+          <w:iCs/>
+          <w:kern w:val="2"/>
+          <w:sz w:val="18"/>
+          <w:szCs w:val="18"/>
+          <w14:ligatures w14:val="standardContextual"/>
+        </w:rPr>
+        <w:t>, we encode input arrays and train a spatial pooler to generate Sparse Distributed Representations (SDRs). The dataset is divided into training and testing subsets, with classifiers trained on the training data and evaluated on the test set. The encoded test data is decoded using HTM and KNN, and the reconstructed values are compared to the original input using similarity metrics, including internal similarity and percentage similarity. Results, visualized with the ScottPlot library in .NET, demonstrate that both classifiers achieve high accuracy in reconstructing input patterns. This research highlights the potential of HTM and KNN in sparse encoding-based input reconstruction, with applications in anomaly detection, data compression, and predictive modeling. Our findings contribute to advancing machine learning techniques that leverage sparse distributed representations for improved classification and reconstruction accuracy.</w:t>
       </w:r>
     </w:p>
     <w:p>
@@ -361,7 +396,21 @@
         <w:rPr>
           <w:rFonts w:cstheme="minorHAnsi"/>
         </w:rPr>
-        <w:t>In this study, we investigate the ability of HTM and KNN classifiers to reconstruct input data from encoded SDR representations. Using the NeocortexAPI, we encode input arrays and train a spatial pooler to generate stable SDRs from raw data. The dataset is divided into training and testing subsets, with classifiers trained on the training data and evaluated on the test set. To assess reconstruction accuracy, we introduce two similarity metrics: internal similarity, which measures the alignment between classifier-predicted values and encoded representations, and percentage similarity, which quantifies the accuracy of reconstruction relative to the original input. Visualization is performed using the ScottPlot library in .NET, enabling a clear comparison between original and reconstructed data [4].</w:t>
+        <w:t xml:space="preserve">In this study, we investigate the ability of HTM and KNN classifiers to reconstruct input data from encoded SDR representations. Using the </w:t>
+      </w:r>
+      <w:proofErr w:type="spellStart"/>
+      <w:r>
+        <w:rPr>
+          <w:rFonts w:cstheme="minorHAnsi"/>
+        </w:rPr>
+        <w:t>NeocortexAPI</w:t>
+      </w:r>
+      <w:proofErr w:type="spellEnd"/>
+      <w:r>
+        <w:rPr>
+          <w:rFonts w:cstheme="minorHAnsi"/>
+        </w:rPr>
+        <w:t>, we encode input arrays and train a spatial pooler to generate stable SDRs from raw data. The dataset is divided into training and testing subsets, with classifiers trained on the training data and evaluated on the test set. To assess reconstruction accuracy, we introduce two similarity metrics: internal similarity, which measures the alignment between classifier-predicted values and encoded representations, and percentage similarity, which quantifies the accuracy of reconstruction relative to the original input. Visualization is performed using the ScottPlot library in .NET, enabling a clear comparison between original and reconstructed data [4].</w:t>
       </w:r>
     </w:p>
     <w:p>
@@ -748,7 +797,15 @@
       </w:pPr>
       <w:bookmarkStart w:id="1" w:name="_Hlk161581337"/>
       <w:r>
-        <w:t>Input reconstruction involves decoding SDRs to recover the original input data. Mnatzaganian et al. [</w:t>
+        <w:t xml:space="preserve">Input reconstruction involves decoding SDRs to recover the original input data. </w:t>
+      </w:r>
+      <w:proofErr w:type="spellStart"/>
+      <w:r>
+        <w:t>Mnatzaganian</w:t>
+      </w:r>
+      <w:proofErr w:type="spellEnd"/>
+      <w:r>
+        <w:t xml:space="preserve"> et al. [</w:t>
       </w:r>
       <w:r>
         <w:t>6</w:t>
@@ -1266,7 +1323,7 @@
           <w:ilvl w:val="0"/>
           <w:numId w:val="10"/>
         </w:numPr>
-        <w:spacing w:after="160" w:line="259" w:lineRule="auto"/>
+        <w:spacing w:line="259" w:lineRule="auto"/>
         <w:jc w:val="both"/>
         <w:rPr>
           <w:rFonts w:cstheme="minorHAnsi"/>
@@ -1297,7 +1354,7 @@
           <w:ilvl w:val="0"/>
           <w:numId w:val="10"/>
         </w:numPr>
-        <w:spacing w:after="160" w:line="259" w:lineRule="auto"/>
+        <w:spacing w:line="259" w:lineRule="auto"/>
         <w:jc w:val="both"/>
         <w:rPr>
           <w:rFonts w:cstheme="minorHAnsi"/>
@@ -1340,7 +1397,7 @@
           <w:ilvl w:val="0"/>
           <w:numId w:val="10"/>
         </w:numPr>
-        <w:spacing w:after="160" w:line="259" w:lineRule="auto"/>
+        <w:spacing w:line="259" w:lineRule="auto"/>
         <w:jc w:val="both"/>
         <w:rPr>
           <w:rFonts w:cstheme="minorHAnsi"/>
@@ -1359,7 +1416,7 @@
           <w:ilvl w:val="0"/>
           <w:numId w:val="10"/>
         </w:numPr>
-        <w:spacing w:after="160" w:line="259" w:lineRule="auto"/>
+        <w:spacing w:line="259" w:lineRule="auto"/>
         <w:jc w:val="both"/>
         <w:rPr>
           <w:rFonts w:cstheme="minorHAnsi"/>
@@ -1443,7 +1500,15 @@
         <w:t xml:space="preserve"> </w:t>
       </w:r>
       <w:r>
-        <w:t>Encoder from the NeocortexAPI repository. These encoded values are then passed through a Spatial Pooler (SP), which learns to generate stable and robust SDR representations. The SDRs serve as the foundation for training both HTM</w:t>
+        <w:t xml:space="preserve">Encoder from the </w:t>
+      </w:r>
+      <w:proofErr w:type="spellStart"/>
+      <w:r>
+        <w:t>NeocortexAPI</w:t>
+      </w:r>
+      <w:proofErr w:type="spellEnd"/>
+      <w:r>
+        <w:t xml:space="preserve"> repository. These encoded values are then passed through a Spatial Pooler (SP), which learns to generate stable and robust SDR representations. The SDRs serve as the foundation for training both HTM</w:t>
       </w:r>
       <w:r>
         <w:t xml:space="preserve"> </w:t>
@@ -1455,10 +1520,7 @@
         <w:t xml:space="preserve"> </w:t>
       </w:r>
       <w:r>
-        <w:t xml:space="preserve">Classifier, which are </w:t>
-      </w:r>
-      <w:r>
-        <w:t>subsequently employed to reconstruct the original input values from test data.</w:t>
+        <w:t>Classifier, which are subsequently employed to reconstruct the original input values from test data.</w:t>
       </w:r>
     </w:p>
     <w:p>
@@ -1589,10 +1651,12 @@
           <w:sz w:val="18"/>
           <w:szCs w:val="18"/>
         </w:rPr>
-        <w:t>High-Level Overview Of The Workflow</w:t>
-      </w:r>
-      <w:r>
-        <w:rPr>
+        <w:t xml:space="preserve">High-Level Overview </w:t>
+      </w:r>
+      <w:proofErr w:type="gramStart"/>
+      <w:r>
+        <w:rPr>
+          <w:rFonts w:cstheme="minorHAnsi"/>
           <w:b w:val="0"/>
           <w:bCs w:val="0"/>
           <w:i/>
@@ -1600,6 +1664,30 @@
           <w:sz w:val="18"/>
           <w:szCs w:val="18"/>
         </w:rPr>
+        <w:t>Of</w:t>
+      </w:r>
+      <w:proofErr w:type="gramEnd"/>
+      <w:r>
+        <w:rPr>
+          <w:rFonts w:cstheme="minorHAnsi"/>
+          <w:b w:val="0"/>
+          <w:bCs w:val="0"/>
+          <w:i/>
+          <w:iCs/>
+          <w:sz w:val="18"/>
+          <w:szCs w:val="18"/>
+        </w:rPr>
+        <w:t xml:space="preserve"> The Workflow</w:t>
+      </w:r>
+      <w:r>
+        <w:rPr>
+          <w:b w:val="0"/>
+          <w:bCs w:val="0"/>
+          <w:i/>
+          <w:iCs/>
+          <w:sz w:val="18"/>
+          <w:szCs w:val="18"/>
+        </w:rPr>
         <w:t xml:space="preserve"> </w:t>
       </w:r>
     </w:p>
@@ -1672,7 +1760,7 @@
           <w:ilvl w:val="0"/>
           <w:numId w:val="9"/>
         </w:numPr>
-        <w:spacing w:after="160" w:line="259" w:lineRule="auto"/>
+        <w:spacing w:line="259" w:lineRule="auto"/>
         <w:jc w:val="both"/>
         <w:rPr>
           <w:rFonts w:cstheme="minorHAnsi"/>
@@ -1691,17 +1779,31 @@
           <w:ilvl w:val="0"/>
           <w:numId w:val="9"/>
         </w:numPr>
-        <w:spacing w:after="160" w:line="259" w:lineRule="auto"/>
-        <w:jc w:val="both"/>
-        <w:rPr>
-          <w:rFonts w:cstheme="minorHAnsi"/>
-        </w:rPr>
-      </w:pPr>
-      <w:r>
-        <w:rPr>
-          <w:rFonts w:cstheme="minorHAnsi"/>
-        </w:rPr>
-        <w:t>The input values are fed into the Scalar Encoder from the NeocortexAPI repository.</w:t>
+        <w:spacing w:line="259" w:lineRule="auto"/>
+        <w:jc w:val="both"/>
+        <w:rPr>
+          <w:rFonts w:cstheme="minorHAnsi"/>
+        </w:rPr>
+      </w:pPr>
+      <w:r>
+        <w:rPr>
+          <w:rFonts w:cstheme="minorHAnsi"/>
+        </w:rPr>
+        <w:t xml:space="preserve">The input values are fed into the Scalar Encoder from the </w:t>
+      </w:r>
+      <w:proofErr w:type="spellStart"/>
+      <w:r>
+        <w:rPr>
+          <w:rFonts w:cstheme="minorHAnsi"/>
+        </w:rPr>
+        <w:t>NeocortexAPI</w:t>
+      </w:r>
+      <w:proofErr w:type="spellEnd"/>
+      <w:r>
+        <w:rPr>
+          <w:rFonts w:cstheme="minorHAnsi"/>
+        </w:rPr>
+        <w:t xml:space="preserve"> repository.</w:t>
       </w:r>
     </w:p>
     <w:p>
@@ -1710,7 +1812,7 @@
           <w:ilvl w:val="0"/>
           <w:numId w:val="9"/>
         </w:numPr>
-        <w:spacing w:after="160" w:line="259" w:lineRule="auto"/>
+        <w:spacing w:line="259" w:lineRule="auto"/>
         <w:jc w:val="both"/>
         <w:rPr>
           <w:rFonts w:cstheme="minorHAnsi"/>
@@ -1729,17 +1831,16 @@
           <w:ilvl w:val="0"/>
           <w:numId w:val="9"/>
         </w:numPr>
-        <w:spacing w:after="160" w:line="259" w:lineRule="auto"/>
-        <w:jc w:val="both"/>
-        <w:rPr>
-          <w:rFonts w:cstheme="minorHAnsi"/>
-        </w:rPr>
-      </w:pPr>
-      <w:r>
-        <w:rPr>
-          <w:rFonts w:cstheme="minorHAnsi"/>
-        </w:rPr>
-        <w:lastRenderedPageBreak/>
+        <w:spacing w:line="259" w:lineRule="auto"/>
+        <w:jc w:val="both"/>
+        <w:rPr>
+          <w:rFonts w:cstheme="minorHAnsi"/>
+        </w:rPr>
+      </w:pPr>
+      <w:r>
+        <w:rPr>
+          <w:rFonts w:cstheme="minorHAnsi"/>
+        </w:rPr>
         <w:t>The SDRs are then passed to the Spatial Pooler (SP) for further processing.</w:t>
       </w:r>
     </w:p>
@@ -1763,7 +1864,7 @@
           <w:ilvl w:val="0"/>
           <w:numId w:val="8"/>
         </w:numPr>
-        <w:spacing w:after="160" w:line="259" w:lineRule="auto"/>
+        <w:spacing w:line="259" w:lineRule="auto"/>
         <w:jc w:val="both"/>
         <w:rPr>
           <w:rFonts w:cstheme="minorHAnsi"/>
@@ -1782,16 +1883,17 @@
           <w:ilvl w:val="0"/>
           <w:numId w:val="8"/>
         </w:numPr>
-        <w:spacing w:after="160" w:line="259" w:lineRule="auto"/>
-        <w:jc w:val="both"/>
-        <w:rPr>
-          <w:rFonts w:cstheme="minorHAnsi"/>
-        </w:rPr>
-      </w:pPr>
-      <w:r>
-        <w:rPr>
-          <w:rFonts w:cstheme="minorHAnsi"/>
-        </w:rPr>
+        <w:spacing w:line="259" w:lineRule="auto"/>
+        <w:jc w:val="both"/>
+        <w:rPr>
+          <w:rFonts w:cstheme="minorHAnsi"/>
+        </w:rPr>
+      </w:pPr>
+      <w:r>
+        <w:rPr>
+          <w:rFonts w:cstheme="minorHAnsi"/>
+        </w:rPr>
+        <w:lastRenderedPageBreak/>
         <w:t>N (Total bits in encoding): 200</w:t>
       </w:r>
     </w:p>
@@ -1801,17 +1903,39 @@
           <w:ilvl w:val="0"/>
           <w:numId w:val="8"/>
         </w:numPr>
-        <w:spacing w:after="160" w:line="259" w:lineRule="auto"/>
-        <w:jc w:val="both"/>
-        <w:rPr>
-          <w:rFonts w:cstheme="minorHAnsi"/>
-        </w:rPr>
-      </w:pPr>
-      <w:r>
-        <w:rPr>
-          <w:rFonts w:cstheme="minorHAnsi"/>
-        </w:rPr>
-        <w:t>MinVal and MaxVal: Defines the range of input values (1 to max value)</w:t>
+        <w:spacing w:line="259" w:lineRule="auto"/>
+        <w:jc w:val="both"/>
+        <w:rPr>
+          <w:rFonts w:cstheme="minorHAnsi"/>
+        </w:rPr>
+      </w:pPr>
+      <w:proofErr w:type="spellStart"/>
+      <w:r>
+        <w:rPr>
+          <w:rFonts w:cstheme="minorHAnsi"/>
+        </w:rPr>
+        <w:t>MinVal</w:t>
+      </w:r>
+      <w:proofErr w:type="spellEnd"/>
+      <w:r>
+        <w:rPr>
+          <w:rFonts w:cstheme="minorHAnsi"/>
+        </w:rPr>
+        <w:t xml:space="preserve"> and </w:t>
+      </w:r>
+      <w:proofErr w:type="spellStart"/>
+      <w:r>
+        <w:rPr>
+          <w:rFonts w:cstheme="minorHAnsi"/>
+        </w:rPr>
+        <w:t>MaxVal</w:t>
+      </w:r>
+      <w:proofErr w:type="spellEnd"/>
+      <w:r>
+        <w:rPr>
+          <w:rFonts w:cstheme="minorHAnsi"/>
+        </w:rPr>
+        <w:t>: Defines the range of input values (1 to max value)</w:t>
       </w:r>
     </w:p>
     <w:p>
@@ -1820,7 +1944,7 @@
           <w:ilvl w:val="0"/>
           <w:numId w:val="8"/>
         </w:numPr>
-        <w:spacing w:after="160" w:line="259" w:lineRule="auto"/>
+        <w:spacing w:line="259" w:lineRule="auto"/>
         <w:jc w:val="both"/>
         <w:rPr>
           <w:rFonts w:cstheme="minorHAnsi"/>
@@ -1851,7 +1975,7 @@
           <w:ilvl w:val="0"/>
           <w:numId w:val="8"/>
         </w:numPr>
-        <w:spacing w:after="160" w:line="259" w:lineRule="auto"/>
+        <w:spacing w:line="259" w:lineRule="auto"/>
         <w:jc w:val="both"/>
         <w:rPr>
           <w:rFonts w:cstheme="minorHAnsi"/>
@@ -2024,13 +2148,7 @@
         <w:rPr>
           <w:rFonts w:cstheme="minorHAnsi"/>
         </w:rPr>
-        <w:t xml:space="preserve">The encoded Sparse Distributed Representations (SDRs) are fed into the Spatial Pooler (SP), a core component of the Hierarchical Temporal Memory (HTM) framework. The SP processes the input patterns and activates specific columns based on the learned synaptic connections, which are strengthened over multiple learning cycles. This process ensures the generation of stable SDRs, where similar input patterns activate similar columns, maintaining consistency and robustness in the representations. Once the SP has been trained and stable SDRs are produced, these representations are used for both training and testing the classifiers. The trained SP output serves as the foundation for the classifiers </w:t>
-      </w:r>
-      <w:r>
-        <w:rPr>
-          <w:rFonts w:cstheme="minorHAnsi"/>
-        </w:rPr>
-        <w:t>to learn and later reconstruct the original input values, enabling accurate and efficient input reconstruction.</w:t>
+        <w:t>The encoded Sparse Distributed Representations (SDRs) are fed into the Spatial Pooler (SP), a core component of the Hierarchical Temporal Memory (HTM) framework. The SP processes the input patterns and activates specific columns based on the learned synaptic connections, which are strengthened over multiple learning cycles. This process ensures the generation of stable SDRs, where similar input patterns activate similar columns, maintaining consistency and robustness in the representations. Once the SP has been trained and stable SDRs are produced, these representations are used for both training and testing the classifiers. The trained SP output serves as the foundation for the classifiers to learn and later reconstruct the original input values, enabling accurate and efficient input reconstruction.</w:t>
       </w:r>
     </w:p>
     <w:p>
@@ -2058,17 +2176,25 @@
           <w:ilvl w:val="0"/>
           <w:numId w:val="11"/>
         </w:numPr>
-        <w:spacing w:after="160" w:line="259" w:lineRule="auto"/>
-        <w:jc w:val="both"/>
-        <w:rPr>
-          <w:rFonts w:cstheme="minorHAnsi"/>
-        </w:rPr>
-      </w:pPr>
-      <w:r>
-        <w:rPr>
-          <w:rFonts w:cstheme="minorHAnsi"/>
-        </w:rPr>
-        <w:t>CellsPerColumn: 10</w:t>
+        <w:spacing w:line="259" w:lineRule="auto"/>
+        <w:jc w:val="both"/>
+        <w:rPr>
+          <w:rFonts w:cstheme="minorHAnsi"/>
+        </w:rPr>
+      </w:pPr>
+      <w:proofErr w:type="spellStart"/>
+      <w:r>
+        <w:rPr>
+          <w:rFonts w:cstheme="minorHAnsi"/>
+        </w:rPr>
+        <w:t>CellsPerColumn</w:t>
+      </w:r>
+      <w:proofErr w:type="spellEnd"/>
+      <w:r>
+        <w:rPr>
+          <w:rFonts w:cstheme="minorHAnsi"/>
+        </w:rPr>
+        <w:t>: 10</w:t>
       </w:r>
     </w:p>
     <w:p>
@@ -2077,17 +2203,25 @@
           <w:ilvl w:val="0"/>
           <w:numId w:val="11"/>
         </w:numPr>
-        <w:spacing w:after="160" w:line="259" w:lineRule="auto"/>
-        <w:jc w:val="both"/>
-        <w:rPr>
-          <w:rFonts w:cstheme="minorHAnsi"/>
-        </w:rPr>
-      </w:pPr>
-      <w:r>
-        <w:rPr>
-          <w:rFonts w:cstheme="minorHAnsi"/>
-        </w:rPr>
-        <w:t>NumColumns: 1024</w:t>
+        <w:spacing w:line="259" w:lineRule="auto"/>
+        <w:jc w:val="both"/>
+        <w:rPr>
+          <w:rFonts w:cstheme="minorHAnsi"/>
+        </w:rPr>
+      </w:pPr>
+      <w:proofErr w:type="spellStart"/>
+      <w:r>
+        <w:rPr>
+          <w:rFonts w:cstheme="minorHAnsi"/>
+        </w:rPr>
+        <w:t>NumColumns</w:t>
+      </w:r>
+      <w:proofErr w:type="spellEnd"/>
+      <w:r>
+        <w:rPr>
+          <w:rFonts w:cstheme="minorHAnsi"/>
+        </w:rPr>
+        <w:t>: 1024</w:t>
       </w:r>
     </w:p>
     <w:p>
@@ -2096,17 +2230,25 @@
           <w:ilvl w:val="0"/>
           <w:numId w:val="11"/>
         </w:numPr>
-        <w:spacing w:after="160" w:line="259" w:lineRule="auto"/>
-        <w:jc w:val="both"/>
-        <w:rPr>
-          <w:rFonts w:cstheme="minorHAnsi"/>
-        </w:rPr>
-      </w:pPr>
-      <w:r>
-        <w:rPr>
-          <w:rFonts w:cstheme="minorHAnsi"/>
-        </w:rPr>
-        <w:t>MaxBoost: 5.0</w:t>
+        <w:spacing w:line="259" w:lineRule="auto"/>
+        <w:jc w:val="both"/>
+        <w:rPr>
+          <w:rFonts w:cstheme="minorHAnsi"/>
+        </w:rPr>
+      </w:pPr>
+      <w:proofErr w:type="spellStart"/>
+      <w:r>
+        <w:rPr>
+          <w:rFonts w:cstheme="minorHAnsi"/>
+        </w:rPr>
+        <w:t>MaxBoost</w:t>
+      </w:r>
+      <w:proofErr w:type="spellEnd"/>
+      <w:r>
+        <w:rPr>
+          <w:rFonts w:cstheme="minorHAnsi"/>
+        </w:rPr>
+        <w:t>: 5.0</w:t>
       </w:r>
     </w:p>
     <w:p>
@@ -2115,17 +2257,25 @@
           <w:ilvl w:val="0"/>
           <w:numId w:val="11"/>
         </w:numPr>
-        <w:spacing w:after="160" w:line="259" w:lineRule="auto"/>
-        <w:jc w:val="both"/>
-        <w:rPr>
-          <w:rFonts w:cstheme="minorHAnsi"/>
-        </w:rPr>
-      </w:pPr>
-      <w:r>
-        <w:rPr>
-          <w:rFonts w:cstheme="minorHAnsi"/>
-        </w:rPr>
-        <w:t>DutyCyclePeriod: 100</w:t>
+        <w:spacing w:line="259" w:lineRule="auto"/>
+        <w:jc w:val="both"/>
+        <w:rPr>
+          <w:rFonts w:cstheme="minorHAnsi"/>
+        </w:rPr>
+      </w:pPr>
+      <w:proofErr w:type="spellStart"/>
+      <w:r>
+        <w:rPr>
+          <w:rFonts w:cstheme="minorHAnsi"/>
+        </w:rPr>
+        <w:t>DutyCyclePeriod</w:t>
+      </w:r>
+      <w:proofErr w:type="spellEnd"/>
+      <w:r>
+        <w:rPr>
+          <w:rFonts w:cstheme="minorHAnsi"/>
+        </w:rPr>
+        <w:t>: 100</w:t>
       </w:r>
     </w:p>
     <w:p>
@@ -2134,17 +2284,25 @@
           <w:ilvl w:val="0"/>
           <w:numId w:val="11"/>
         </w:numPr>
-        <w:spacing w:after="160" w:line="259" w:lineRule="auto"/>
-        <w:jc w:val="both"/>
-        <w:rPr>
-          <w:rFonts w:cstheme="minorHAnsi"/>
-        </w:rPr>
-      </w:pPr>
-      <w:r>
-        <w:rPr>
-          <w:rFonts w:cstheme="minorHAnsi"/>
-        </w:rPr>
-        <w:t>MinPctOverlapDutyCycles: 1.0</w:t>
+        <w:spacing w:line="259" w:lineRule="auto"/>
+        <w:jc w:val="both"/>
+        <w:rPr>
+          <w:rFonts w:cstheme="minorHAnsi"/>
+        </w:rPr>
+      </w:pPr>
+      <w:proofErr w:type="spellStart"/>
+      <w:r>
+        <w:rPr>
+          <w:rFonts w:cstheme="minorHAnsi"/>
+        </w:rPr>
+        <w:t>MinPctOverlapDutyCycles</w:t>
+      </w:r>
+      <w:proofErr w:type="spellEnd"/>
+      <w:r>
+        <w:rPr>
+          <w:rFonts w:cstheme="minorHAnsi"/>
+        </w:rPr>
+        <w:t>: 1.0</w:t>
       </w:r>
     </w:p>
     <w:p>
@@ -2153,17 +2311,25 @@
           <w:ilvl w:val="0"/>
           <w:numId w:val="11"/>
         </w:numPr>
-        <w:spacing w:after="160" w:line="259" w:lineRule="auto"/>
-        <w:jc w:val="both"/>
-        <w:rPr>
-          <w:rFonts w:cstheme="minorHAnsi"/>
-        </w:rPr>
-      </w:pPr>
-      <w:r>
-        <w:rPr>
-          <w:rFonts w:cstheme="minorHAnsi"/>
-        </w:rPr>
-        <w:t>NumActiveColumnsPerInhArea: 2% of total columns</w:t>
+        <w:spacing w:line="259" w:lineRule="auto"/>
+        <w:jc w:val="both"/>
+        <w:rPr>
+          <w:rFonts w:cstheme="minorHAnsi"/>
+        </w:rPr>
+      </w:pPr>
+      <w:proofErr w:type="spellStart"/>
+      <w:r>
+        <w:rPr>
+          <w:rFonts w:cstheme="minorHAnsi"/>
+        </w:rPr>
+        <w:t>NumActiveColumnsPerInhArea</w:t>
+      </w:r>
+      <w:proofErr w:type="spellEnd"/>
+      <w:r>
+        <w:rPr>
+          <w:rFonts w:cstheme="minorHAnsi"/>
+        </w:rPr>
+        <w:t>: 2% of total columns</w:t>
       </w:r>
     </w:p>
     <w:p>
@@ -2172,17 +2338,25 @@
           <w:ilvl w:val="0"/>
           <w:numId w:val="11"/>
         </w:numPr>
-        <w:spacing w:after="160" w:line="259" w:lineRule="auto"/>
-        <w:jc w:val="both"/>
-        <w:rPr>
-          <w:rFonts w:cstheme="minorHAnsi"/>
-        </w:rPr>
-      </w:pPr>
-      <w:r>
-        <w:rPr>
-          <w:rFonts w:cstheme="minorHAnsi"/>
-        </w:rPr>
-        <w:t>PotentialRadius: 15% of input bits</w:t>
+        <w:spacing w:line="259" w:lineRule="auto"/>
+        <w:jc w:val="both"/>
+        <w:rPr>
+          <w:rFonts w:cstheme="minorHAnsi"/>
+        </w:rPr>
+      </w:pPr>
+      <w:proofErr w:type="spellStart"/>
+      <w:r>
+        <w:rPr>
+          <w:rFonts w:cstheme="minorHAnsi"/>
+        </w:rPr>
+        <w:t>PotentialRadius</w:t>
+      </w:r>
+      <w:proofErr w:type="spellEnd"/>
+      <w:r>
+        <w:rPr>
+          <w:rFonts w:cstheme="minorHAnsi"/>
+        </w:rPr>
+        <w:t>: 15% of input bits</w:t>
       </w:r>
     </w:p>
     <w:p>
@@ -2349,55 +2523,58 @@
           <w:spacing w:val="0"/>
           <w:lang w:val="en-US" w:eastAsia="en-US"/>
         </w:rPr>
-        <w:t xml:space="preserve">The KNN Classifier stores Sparse Distributed Representations (SDRs) in memory, allowing it to compare and analyze patterns during the reconstruction process. When reconstructing inputs, the classifier identifies the nearest neighbors in the SDR space by calculating the similarity between the input SDR and the stored representations. The K value, which determines the number of neighbors considered for prediction, is carefully optimized to balance accuracy and computational efficiency. By selecting the most similar SDRs and averaging their corresponding input values, the KNN Classifier effectively reconstructs the original inputs. This approach leverages the simplicity and effectiveness of the </w:t>
-      </w:r>
-      <w:r>
-        <w:rPr>
-          <w:spacing w:val="0"/>
-          <w:lang w:val="en-US" w:eastAsia="en-US"/>
+        <w:t>The KNN Classifier stores Sparse Distributed Representations (SDRs) in memory, allowing it to compare and analyze patterns during the reconstruction process. When reconstructing inputs, the classifier identifies the nearest neighbors in the SDR space by calculating the similarity between the input SDR and the stored representations. The K value, which determines the number of neighbors considered for prediction, is carefully optimized to balance accuracy and computational efficiency. By selecting the most similar SDRs and averaging their corresponding input values, the KNN Classifier effectively reconstructs the original inputs. This approach leverages the simplicity and effectiveness of the KNN algorithm, making it a reliable method for input reconstruction tasks.</w:t>
+      </w:r>
+    </w:p>
+    <w:p>
+      <w:pPr>
+        <w:pStyle w:val="Heading3"/>
+        <w:rPr>
+          <w:b/>
+          <w:bCs/>
+        </w:rPr>
+      </w:pPr>
+      <w:r>
+        <w:rPr>
+          <w:b/>
+          <w:bCs/>
+        </w:rPr>
+        <w:t>Reconstruction Process:</w:t>
+      </w:r>
+    </w:p>
+    <w:p>
+      <w:pPr>
+        <w:jc w:val="both"/>
+        <w:rPr>
+          <w:rFonts w:cstheme="minorHAnsi"/>
+        </w:rPr>
+      </w:pPr>
+      <w:r>
+        <w:rPr>
+          <w:rFonts w:cstheme="minorHAnsi"/>
+        </w:rPr>
+        <w:t xml:space="preserve">The reconstruction process begins by randomly shuffling the dataset to ensure an unbiased distribution of data. The shuffled dataset is then split into two subsets: 80% for training and 20% for testing. The training subset is encoded into Sparse Distributed Representations (SDRs), which are used to train the classifiers, specifically the HTMClassifier and </w:t>
+      </w:r>
+      <w:proofErr w:type="spellStart"/>
+      <w:r>
+        <w:rPr>
+          <w:rFonts w:cstheme="minorHAnsi"/>
+        </w:rPr>
+        <w:t>KNNClassifier</w:t>
+      </w:r>
+      <w:proofErr w:type="spellEnd"/>
+      <w:r>
+        <w:rPr>
+          <w:rFonts w:cstheme="minorHAnsi"/>
+        </w:rPr>
+        <w:t xml:space="preserve">. Once the classifiers are trained, the remaining 20% of the dataset, also encoded into SDRs, is fed into the trained classifiers for prediction. The classifiers attempt to reconstruct the original input values from these SDRs, effectively reversing the encoding process. This </w:t>
+      </w:r>
+      <w:r>
+        <w:rPr>
+          <w:rFonts w:cstheme="minorHAnsi"/>
         </w:rPr>
         <w:lastRenderedPageBreak/>
-        <w:t>KNN algorithm, making it a reliable method for input reconstruction tasks.</w:t>
-      </w:r>
-    </w:p>
-    <w:p>
-      <w:pPr>
-        <w:pStyle w:val="BodyText"/>
-        <w:ind w:firstLine="0"/>
-        <w:rPr>
-          <w:spacing w:val="0"/>
-          <w:lang w:val="en-US" w:eastAsia="en-US"/>
-        </w:rPr>
-      </w:pPr>
-    </w:p>
-    <w:p>
-      <w:pPr>
-        <w:pStyle w:val="Heading3"/>
-        <w:rPr>
-          <w:b/>
-          <w:bCs/>
-        </w:rPr>
-      </w:pPr>
-      <w:r>
-        <w:rPr>
-          <w:b/>
-          <w:bCs/>
-        </w:rPr>
-        <w:t>Reconstruction Process:</w:t>
-      </w:r>
-    </w:p>
-    <w:p>
-      <w:pPr>
-        <w:jc w:val="both"/>
-        <w:rPr>
-          <w:rFonts w:cstheme="minorHAnsi"/>
-        </w:rPr>
-      </w:pPr>
-      <w:r>
-        <w:rPr>
-          <w:rFonts w:cstheme="minorHAnsi"/>
-        </w:rPr>
-        <w:t>The reconstruction process begins by randomly shuffling the dataset to ensure an unbiased distribution of data. The shuffled dataset is then split into two subsets: 80% for training and 20% for testing. The training subset is encoded into Sparse Distributed Representations (SDRs), which are used to train the classifiers, specifically the HTMClassifier and KNNClassifier. Once the classifiers are trained, the remaining 20% of the dataset, also encoded into SDRs, is fed into the trained classifiers for prediction. The classifiers attempt to reconstruct the original input values from these SDRs, effectively reversing the encoding process. This reconstruction step is critical for evaluating the classifiers' ability to accurately recover the original data from the encoded representations. The reconstructed values are then compared with the original inputs to assess the performance of the classifiers, providing insights into their effectiveness in input reconstruction tasks.</w:t>
+        <w:t>reconstruction step is critical for evaluating the classifiers' ability to accurately recover the original data from the encoded representations. The reconstructed values are then compared with the original inputs to assess the performance of the classifiers, providing insights into their effectiveness in input reconstruction tasks.</w:t>
       </w:r>
     </w:p>
     <w:p>
@@ -2613,7 +2790,10 @@
         <w:jc w:val="both"/>
       </w:pPr>
       <w:r>
-        <w:t>The internal similarity metric plays a crucial role in evaluating the performance of the classifiers by measuring the alignment between the predicted values generated by the classifier and the encoded Sparse Distributed Representations (SDRs). This metric assesses whether the classifier maintains consistency with the patterns it has learned during the training phase. By comparing the predicted outputs to the encoded SDRs, internal similarity provides insight into how well the classifier generalizes from the training data and whether it can accurately reconstruct input values. This evaluation is essential for ensuring the reliability and effectiveness of the classifiers in tasks such as input reconstruction, anomaly detection, and predictive modeling.</w:t>
+        <w:t xml:space="preserve">The internal similarity metric plays a crucial role in evaluating the performance of the classifiers by measuring the alignment between the predicted values generated by the classifier and the encoded Sparse Distributed Representations (SDRs). This metric assesses whether the classifier maintains consistency with the patterns it has learned during the training phase. By comparing the predicted outputs to the encoded SDRs, internal similarity provides insight into how well the </w:t>
+      </w:r>
+      <w:r>
+        <w:t>classifier generalizes from the training data and whether it can accurately reconstruct input values. This evaluation is essential for ensuring the reliability and effectiveness of the classifiers in tasks such as input reconstruction, anomaly detection, and predictive modeling.</w:t>
       </w:r>
     </w:p>
     <w:p>
@@ -2741,17 +2921,8 @@
         <w:t xml:space="preserve"> </w:t>
       </w:r>
       <w:r>
-        <w:t xml:space="preserve">Classifier, enabling a detailed analysis of their performance. Through the analysis of similarity metrics, such as internal similarity and percentage similarity, we </w:t>
-      </w:r>
-      <w:r>
-        <w:lastRenderedPageBreak/>
-        <w:t>determine which classifier is more effective for input reconstruction using Sparse Distributed Representations (SDRs). These visualizations and metrics collectively provide valuable insights into the strengths and limitations of each classifier, guiding the evaluation of their suitability for tasks such as input reconstruction, anomaly detection, and predictive modeling.</w:t>
-      </w:r>
-    </w:p>
-    <w:p>
-      <w:pPr>
-        <w:jc w:val="both"/>
-      </w:pPr>
+        <w:t>Classifier, enabling a detailed analysis of their performance. Through the analysis of similarity metrics, such as internal similarity and percentage similarity, we determine which classifier is more effective for input reconstruction using Sparse Distributed Representations (SDRs). These visualizations and metrics collectively provide valuable insights into the strengths and limitations of each classifier, guiding the evaluation of their suitability for tasks such as input reconstruction, anomaly detection, and predictive modeling.</w:t>
+      </w:r>
     </w:p>
     <w:p>
       <w:pPr>
@@ -2772,6 +2943,7 @@
     <w:p>
       <w:pPr>
         <w:pStyle w:val="Heading2"/>
+        <w:spacing w:before="0"/>
         <w:rPr>
           <w:b/>
           <w:bCs/>
@@ -2785,7 +2957,6 @@
         <w:t xml:space="preserve"> Tools and Technologies</w:t>
       </w:r>
     </w:p>
-    <w:p/>
     <w:p>
       <w:pPr>
         <w:spacing w:after="160" w:line="259" w:lineRule="auto"/>
@@ -2822,8 +2993,10 @@
         <w:jc w:val="both"/>
       </w:pPr>
       <w:r>
+        <w:lastRenderedPageBreak/>
         <w:t>C# (.NET Core</w:t>
       </w:r>
+      <w:proofErr w:type="gramStart"/>
       <w:r>
         <w:t>)</w:t>
       </w:r>
@@ -2831,7 +3004,11 @@
         <w:t xml:space="preserve"> </w:t>
       </w:r>
       <w:r>
-        <w:t xml:space="preserve">:- </w:t>
+        <w:t>:</w:t>
+      </w:r>
+      <w:proofErr w:type="gramEnd"/>
+      <w:r>
+        <w:t xml:space="preserve">- </w:t>
       </w:r>
       <w:r>
         <w:t>The primary programming language and framework used for implementation.</w:t>
@@ -2866,9 +3043,10 @@
           <w:ilvl w:val="0"/>
           <w:numId w:val="13"/>
         </w:numPr>
-        <w:spacing w:after="160" w:line="259" w:lineRule="auto"/>
-        <w:jc w:val="both"/>
-      </w:pPr>
+        <w:spacing w:line="259" w:lineRule="auto"/>
+        <w:jc w:val="both"/>
+      </w:pPr>
+      <w:proofErr w:type="gramStart"/>
       <w:r>
         <w:t>NeoCortexAPI</w:t>
       </w:r>
@@ -2876,7 +3054,11 @@
         <w:t xml:space="preserve"> </w:t>
       </w:r>
       <w:r>
-        <w:t xml:space="preserve">:- </w:t>
+        <w:t>:</w:t>
+      </w:r>
+      <w:proofErr w:type="gramEnd"/>
+      <w:r>
+        <w:t xml:space="preserve">- </w:t>
       </w:r>
       <w:r>
         <w:t>A C# implementation of Hierarchical Temporal Memory (HTM) used for encoding, SDR generation, and classification.</w:t>
@@ -2888,7 +3070,7 @@
           <w:ilvl w:val="1"/>
           <w:numId w:val="13"/>
         </w:numPr>
-        <w:spacing w:after="160" w:line="259" w:lineRule="auto"/>
+        <w:spacing w:line="259" w:lineRule="auto"/>
         <w:jc w:val="both"/>
       </w:pPr>
       <w:r>
@@ -2909,7 +3091,7 @@
           <w:ilvl w:val="0"/>
           <w:numId w:val="13"/>
         </w:numPr>
-        <w:spacing w:after="160" w:line="259" w:lineRule="auto"/>
+        <w:spacing w:line="259" w:lineRule="auto"/>
         <w:jc w:val="both"/>
       </w:pPr>
       <w:r>
@@ -2918,11 +3100,16 @@
       <w:r>
         <w:t xml:space="preserve"> </w:t>
       </w:r>
+      <w:proofErr w:type="gramStart"/>
       <w:r>
         <w:t>Classifier</w:t>
       </w:r>
       <w:r>
-        <w:t xml:space="preserve"> :- </w:t>
+        <w:t xml:space="preserve"> :</w:t>
+      </w:r>
+      <w:proofErr w:type="gramEnd"/>
+      <w:r>
+        <w:t xml:space="preserve">- </w:t>
       </w:r>
       <w:r>
         <w:t>A classification model within NeoCortexAPI, used for learning and predicting SDR-based patterns.</w:t>
@@ -2934,7 +3121,7 @@
           <w:ilvl w:val="0"/>
           <w:numId w:val="13"/>
         </w:numPr>
-        <w:spacing w:after="160" w:line="259" w:lineRule="auto"/>
+        <w:spacing w:line="259" w:lineRule="auto"/>
         <w:jc w:val="both"/>
       </w:pPr>
       <w:r>
@@ -2943,11 +3130,16 @@
       <w:r>
         <w:t xml:space="preserve"> </w:t>
       </w:r>
+      <w:proofErr w:type="gramStart"/>
       <w:r>
         <w:t>Classifier</w:t>
       </w:r>
       <w:r>
-        <w:t xml:space="preserve"> :- </w:t>
+        <w:t xml:space="preserve"> :</w:t>
+      </w:r>
+      <w:proofErr w:type="gramEnd"/>
+      <w:r>
+        <w:t xml:space="preserve">- </w:t>
       </w:r>
       <w:r>
         <w:t>A K-Nearest Neighbors (KNN) classifier for reconstructing input values based on nearest neighbors in SDR space.</w:t>
@@ -2976,14 +3168,22 @@
           <w:ilvl w:val="0"/>
           <w:numId w:val="14"/>
         </w:numPr>
-        <w:spacing w:after="160" w:line="259" w:lineRule="auto"/>
-        <w:jc w:val="both"/>
-      </w:pPr>
-      <w:r>
-        <w:t>ScottPlot (for .NET Core)</w:t>
-      </w:r>
-      <w:r>
-        <w:t xml:space="preserve">:- </w:t>
+        <w:spacing w:line="259" w:lineRule="auto"/>
+        <w:jc w:val="both"/>
+      </w:pPr>
+      <w:r>
+        <w:t>ScottPlot (for .NET Core</w:t>
+      </w:r>
+      <w:proofErr w:type="gramStart"/>
+      <w:r>
+        <w:t>)</w:t>
+      </w:r>
+      <w:r>
+        <w:t>:-</w:t>
+      </w:r>
+      <w:proofErr w:type="gramEnd"/>
+      <w:r>
+        <w:t xml:space="preserve"> </w:t>
       </w:r>
       <w:r>
         <w:t>A .NET-based library used for plotting similarity metrics and classifier performance.</w:t>
@@ -2995,7 +3195,7 @@
           <w:ilvl w:val="1"/>
           <w:numId w:val="14"/>
         </w:numPr>
-        <w:spacing w:after="160" w:line="259" w:lineRule="auto"/>
+        <w:spacing w:line="259" w:lineRule="auto"/>
         <w:jc w:val="both"/>
       </w:pPr>
       <w:r>
@@ -3016,7 +3216,7 @@
           <w:ilvl w:val="0"/>
           <w:numId w:val="14"/>
         </w:numPr>
-        <w:spacing w:after="160" w:line="259" w:lineRule="auto"/>
+        <w:spacing w:line="259" w:lineRule="auto"/>
         <w:jc w:val="both"/>
       </w:pPr>
       <w:r>
@@ -3047,6 +3247,7 @@
           <w:ilvl w:val="0"/>
           <w:numId w:val="20"/>
         </w:numPr>
+        <w:spacing w:after="0"/>
         <w:jc w:val="both"/>
         <w:rPr>
           <w:rFonts w:ascii="Times New Roman" w:hAnsi="Times New Roman"/>
@@ -3070,6 +3271,7 @@
           <w:ilvl w:val="0"/>
           <w:numId w:val="20"/>
         </w:numPr>
+        <w:spacing w:after="0"/>
         <w:jc w:val="both"/>
         <w:rPr>
           <w:rFonts w:ascii="Times New Roman" w:hAnsi="Times New Roman"/>
@@ -3093,6 +3295,7 @@
           <w:ilvl w:val="0"/>
           <w:numId w:val="20"/>
         </w:numPr>
+        <w:spacing w:after="0"/>
         <w:jc w:val="both"/>
         <w:rPr>
           <w:rFonts w:ascii="Times New Roman" w:hAnsi="Times New Roman"/>
@@ -3177,7 +3380,7 @@
           <w:ilvl w:val="0"/>
           <w:numId w:val="16"/>
         </w:numPr>
-        <w:spacing w:after="160" w:line="259" w:lineRule="auto"/>
+        <w:spacing w:line="259" w:lineRule="auto"/>
         <w:jc w:val="both"/>
       </w:pPr>
       <w:r>
@@ -3190,7 +3393,7 @@
           <w:ilvl w:val="0"/>
           <w:numId w:val="16"/>
         </w:numPr>
-        <w:spacing w:after="160" w:line="259" w:lineRule="auto"/>
+        <w:spacing w:line="259" w:lineRule="auto"/>
         <w:jc w:val="both"/>
       </w:pPr>
       <w:r>
@@ -3209,7 +3412,7 @@
           <w:ilvl w:val="0"/>
           <w:numId w:val="16"/>
         </w:numPr>
-        <w:spacing w:after="160" w:line="259" w:lineRule="auto"/>
+        <w:spacing w:line="259" w:lineRule="auto"/>
         <w:jc w:val="both"/>
       </w:pPr>
       <w:r>
@@ -3222,11 +3425,16 @@
           <w:ilvl w:val="1"/>
           <w:numId w:val="16"/>
         </w:numPr>
-        <w:spacing w:after="160" w:line="259" w:lineRule="auto"/>
-        <w:jc w:val="both"/>
-      </w:pPr>
-      <w:r>
-        <w:t>System.Collections.Generic—For data structures and result storage.</w:t>
+        <w:spacing w:line="259" w:lineRule="auto"/>
+        <w:jc w:val="both"/>
+      </w:pPr>
+      <w:proofErr w:type="gramStart"/>
+      <w:r>
+        <w:t>System.Collections.Generic</w:t>
+      </w:r>
+      <w:proofErr w:type="gramEnd"/>
+      <w:r>
+        <w:t>—For data structures and result storage.</w:t>
       </w:r>
     </w:p>
     <w:p>
@@ -3235,7 +3443,7 @@
           <w:ilvl w:val="1"/>
           <w:numId w:val="16"/>
         </w:numPr>
-        <w:spacing w:after="160" w:line="259" w:lineRule="auto"/>
+        <w:spacing w:line="259" w:lineRule="auto"/>
         <w:jc w:val="both"/>
       </w:pPr>
       <w:r>
@@ -3248,7 +3456,7 @@
           <w:ilvl w:val="1"/>
           <w:numId w:val="16"/>
         </w:numPr>
-        <w:spacing w:after="160" w:line="259" w:lineRule="auto"/>
+        <w:spacing w:line="259" w:lineRule="auto"/>
         <w:jc w:val="both"/>
       </w:pPr>
       <w:r>
@@ -3278,7 +3486,7 @@
           <w:ilvl w:val="0"/>
           <w:numId w:val="21"/>
         </w:numPr>
-        <w:spacing w:after="160" w:line="259" w:lineRule="auto"/>
+        <w:spacing w:line="259" w:lineRule="auto"/>
         <w:jc w:val="both"/>
       </w:pPr>
       <w:r>
@@ -3292,6 +3500,7 @@
           <w:ilvl w:val="1"/>
           <w:numId w:val="21"/>
         </w:numPr>
+        <w:spacing w:after="0"/>
         <w:rPr>
           <w:rFonts w:ascii="Times New Roman" w:hAnsi="Times New Roman"/>
           <w:sz w:val="20"/>
@@ -3325,6 +3534,7 @@
           <w:ilvl w:val="1"/>
           <w:numId w:val="21"/>
         </w:numPr>
+        <w:spacing w:after="0"/>
         <w:jc w:val="both"/>
         <w:rPr>
           <w:rFonts w:ascii="Times New Roman" w:hAnsi="Times New Roman"/>
@@ -3349,7 +3559,7 @@
           <w:ilvl w:val="0"/>
           <w:numId w:val="21"/>
         </w:numPr>
-        <w:spacing w:after="160" w:line="259" w:lineRule="auto"/>
+        <w:spacing w:line="259" w:lineRule="auto"/>
         <w:jc w:val="both"/>
       </w:pPr>
       <w:r>
@@ -3363,6 +3573,7 @@
           <w:ilvl w:val="1"/>
           <w:numId w:val="21"/>
         </w:numPr>
+        <w:spacing w:after="0"/>
         <w:jc w:val="both"/>
         <w:rPr>
           <w:rFonts w:ascii="Times New Roman" w:hAnsi="Times New Roman"/>
@@ -3385,7 +3596,7 @@
           <w:ilvl w:val="0"/>
           <w:numId w:val="21"/>
         </w:numPr>
-        <w:spacing w:after="160" w:line="259" w:lineRule="auto"/>
+        <w:spacing w:line="259" w:lineRule="auto"/>
         <w:jc w:val="both"/>
       </w:pPr>
       <w:r>
@@ -3399,6 +3610,7 @@
           <w:ilvl w:val="1"/>
           <w:numId w:val="21"/>
         </w:numPr>
+        <w:spacing w:after="0"/>
         <w:jc w:val="both"/>
         <w:rPr>
           <w:rFonts w:ascii="Times New Roman" w:hAnsi="Times New Roman"/>
@@ -3422,6 +3634,7 @@
           <w:ilvl w:val="1"/>
           <w:numId w:val="21"/>
         </w:numPr>
+        <w:spacing w:after="0"/>
         <w:jc w:val="both"/>
         <w:rPr>
           <w:rFonts w:ascii="Times New Roman" w:hAnsi="Times New Roman"/>
@@ -3494,18 +3707,89 @@
         <w:t>Class: SpatialPoolerInputReconstructionExperiment</w:t>
       </w:r>
     </w:p>
-    <w:p/>
     <w:p>
       <w:pPr>
         <w:spacing w:after="160" w:line="259" w:lineRule="auto"/>
         <w:jc w:val="both"/>
       </w:pPr>
       <w:r>
-        <w:t xml:space="preserve">The SpatialPoolerInputReconstructionExperiment class is the core of the experiment. It orchestrates the entire process of input reconstruction using Sparse Distributed Representations (SDRs), Hierarchical Temporal Memory (HTM), and K-Nearest Neighbors (KNN) classifiers. The class initializes the necessary components, such as the Spatial Pooler (SP) and Scalar Encoder, and manages the training and evaluation of the classifiers. It also handles the </w:t>
+        <w:t>The SpatialPoolerInputReconstructionExperiment class</w:t>
+      </w:r>
+      <w:r>
+        <w:t xml:space="preserve"> </w:t>
+      </w:r>
+      <w:r>
+        <w:t>is the core of the experiment. It orchestrates the entire process of input reconstruction using Sparse Distributed Representations (SDRs), Hierarchical Temporal Memory (HTM), and K-Nearest Neighbors (KNN) classifiers. The class initializes the necessary components, such as the Spatial Pooler (SP) and Scalar Encoder, and manages the training and evaluation of the classifiers. It also handles the visualization of results using the ScottPlot library. The class is designed to be modular, with each method performing a specific task, such as training the SP, training the classifiers, reconstructing inputs, and plotting results. This modular structure makes the code easy to understand, extend, and maintain.</w:t>
+      </w:r>
+    </w:p>
+    <w:p>
+      <w:pPr>
+        <w:pStyle w:val="Heading3"/>
+        <w:rPr>
+          <w:b/>
+          <w:bCs/>
+        </w:rPr>
+      </w:pPr>
+      <w:r>
+        <w:rPr>
+          <w:b/>
+          <w:bCs/>
+        </w:rPr>
+        <w:t> RunExperiment()</w:t>
+      </w:r>
+    </w:p>
+    <w:p>
+      <w:pPr>
+        <w:spacing w:after="160" w:line="259" w:lineRule="auto"/>
+        <w:jc w:val="both"/>
+      </w:pPr>
+      <w:r>
+        <w:t>The RunExperiment method is the entry point of the experiment. It initializes the Spatial Pooler (SP) and Scalar Encoder with predefined parameters. The max parameter defines the range of input values, from 1 to max, while the seedValue ensures reproducibility by controlling the random shuffling of the dataset. The method first trains the SP using the </w:t>
+      </w:r>
+      <w:proofErr w:type="gramStart"/>
+      <w:r>
+        <w:t>TrainSpatialPooler(</w:t>
+      </w:r>
+      <w:proofErr w:type="gramEnd"/>
+      <w:r>
+        <w:t>) method, which generates stable SDR representations of the input data. After training the SP, the method calls </w:t>
+      </w:r>
+      <w:proofErr w:type="gramStart"/>
+      <w:r>
+        <w:t>RunReconstructionExperiment(</w:t>
+      </w:r>
+      <w:proofErr w:type="gramEnd"/>
+      <w:r>
+        <w:t>) to train the classifiers and evaluate their performance on the test data. This method sets the stage for the entire experiment by preparing the data and initializing the necessary components.</w:t>
+      </w:r>
+    </w:p>
+    <w:p>
+      <w:pPr>
+        <w:pStyle w:val="Heading3"/>
+        <w:rPr>
+          <w:b/>
+          <w:bCs/>
+        </w:rPr>
+      </w:pPr>
+      <w:r>
+        <w:rPr>
+          <w:b/>
+          <w:bCs/>
+        </w:rPr>
+        <w:t>TrainSpatialPooler()</w:t>
+      </w:r>
+    </w:p>
+    <w:p>
+      <w:pPr>
+        <w:spacing w:after="160" w:line="259" w:lineRule="auto"/>
+        <w:jc w:val="both"/>
+      </w:pPr>
+      <w:r>
+        <w:t xml:space="preserve">The TrainSpatialPooler method is responsible for training the Spatial Pooler (SP) to generate stable SDR representations of the input data. It uses the Homeostatic Plasticity Controller (HPA) to monitor the stability of the SP during training. The SP is trained over multiple cycles, and the method logs the training progress, including the stability of the SDRs and the time taken for training. The training process continues until the SP reaches a stable state, where similar inputs consistently activate similar columns. This method is critical for ensuring that the SP can generate </w:t>
       </w:r>
       <w:r>
         <w:lastRenderedPageBreak/>
-        <w:t>visualization of results using the ScottPlot library. The class is designed to be modular, with each method performing a specific task, such as training the SP, training the classifiers, reconstructing inputs, and plotting results. This modular structure makes the code easy to understand, extend, and maintain.</w:t>
+        <w:t>reliable SDRs, which are essential for the subsequent steps of the experiment.</w:t>
       </w:r>
     </w:p>
     <w:p>
@@ -3521,17 +3805,44 @@
           <w:b/>
           <w:bCs/>
         </w:rPr>
-        <w:t> RunExperiment()</w:t>
-      </w:r>
-    </w:p>
-    <w:p/>
+        <w:t>RunReconstructionExperiment()</w:t>
+      </w:r>
+    </w:p>
     <w:p>
       <w:pPr>
         <w:spacing w:after="160" w:line="259" w:lineRule="auto"/>
         <w:jc w:val="both"/>
       </w:pPr>
       <w:r>
-        <w:t>The RunExperiment method is the entry point of the experiment. It initializes the Spatial Pooler (SP) and Scalar Encoder with predefined parameters. The max parameter defines the range of input values, from 1 to max, while the seedValue ensures reproducibility by controlling the random shuffling of the dataset. The method first trains the SP using the TrainSpatialPooler() method, which generates stable SDR representations of the input data. After training the SP, the method calls RunReconstructionExperiment() to train the classifiers and evaluate their performance on the test data. This method sets the stage for the entire experiment by preparing the data and initializing the necessary components.</w:t>
+        <w:t>The RunReconstructionExperiment method splits the dataset into 80% training and 20% testing subsets. It trains the HTM</w:t>
+      </w:r>
+      <w:r>
+        <w:t xml:space="preserve"> </w:t>
+      </w:r>
+      <w:r>
+        <w:t>Classifier and KNN</w:t>
+      </w:r>
+      <w:r>
+        <w:t xml:space="preserve"> </w:t>
+      </w:r>
+      <w:r>
+        <w:t>Classifier on the training data, using the SDRs generated by the SP. After training, the method reconstructs the input values from the test data using the trained classifiers. It computes similarity metrics, such as internal similarity and percentage similarity, to evaluate the reconstruction accuracy. The results are stored in a dictionary and later visualized using the ScottPlot library. This method is the core of the experiment, as it trains the classifiers and evaluates their performance on unseen data.</w:t>
+      </w:r>
+    </w:p>
+    <w:p>
+      <w:pPr>
+        <w:pStyle w:val="Heading3"/>
+        <w:rPr>
+          <w:b/>
+          <w:bCs/>
+        </w:rPr>
+      </w:pPr>
+      <w:r>
+        <w:rPr>
+          <w:b/>
+          <w:bCs/>
+        </w:rPr>
+        <w:t>ReconstructionPart()</w:t>
       </w:r>
     </w:p>
     <w:p>
@@ -3539,6 +3850,15 @@
         <w:spacing w:after="160" w:line="259" w:lineRule="auto"/>
         <w:jc w:val="both"/>
       </w:pPr>
+      <w:r>
+        <w:t>The </w:t>
+      </w:r>
+      <w:r>
+        <w:t>Reconstruction Part</w:t>
+      </w:r>
+      <w:r>
+        <w:t> method performs the actual reconstruction of input values using the trained classifiers. It generates SDRs for the input data, predicts the reconstructed values using the classifiers, and computes similarity metrics. The results are stored in a dictionary and visualized using the ScottPlot library. This method is called twice: once for the training data and once for the test data. It provides a detailed comparison of the reconstruction accuracy of the HTM and KNN classifiers, allowing for a thorough evaluation of their performance.</w:t>
+      </w:r>
     </w:p>
     <w:p>
       <w:pPr>
@@ -3553,107 +3873,9 @@
           <w:b/>
           <w:bCs/>
         </w:rPr>
-        <w:t>TrainSpatialPooler()</w:t>
-      </w:r>
-    </w:p>
-    <w:p/>
-    <w:p>
-      <w:pPr>
-        <w:spacing w:after="160" w:line="259" w:lineRule="auto"/>
-        <w:jc w:val="both"/>
-      </w:pPr>
-      <w:r>
-        <w:t>The TrainSpatialPooler method is responsible for training the Spatial Pooler (SP) to generate stable SDR representations of the input data. It uses the Homeostatic Plasticity Controller (HPA) to monitor the stability of the SP during training. The SP is trained over multiple cycles, and the method logs the training progress, including the stability of the SDRs and the time taken for training. The training process continues until the SP reaches a stable state, where similar inputs consistently activate similar columns. This method is critical for ensuring that the SP can generate reliable SDRs, which are essential for the subsequent steps of the experiment.</w:t>
-      </w:r>
-    </w:p>
-    <w:p>
-      <w:pPr>
-        <w:pStyle w:val="Heading3"/>
-        <w:rPr>
-          <w:b/>
-          <w:bCs/>
-        </w:rPr>
-      </w:pPr>
-      <w:r>
-        <w:rPr>
-          <w:b/>
-          <w:bCs/>
-        </w:rPr>
-        <w:t>RunReconstructionExperiment()</w:t>
-      </w:r>
-    </w:p>
-    <w:p/>
-    <w:p>
-      <w:pPr>
-        <w:spacing w:after="160" w:line="259" w:lineRule="auto"/>
-        <w:jc w:val="both"/>
-      </w:pPr>
-      <w:r>
-        <w:t>The RunReconstructionExperiment method splits the dataset into 80% training and 20% testing subsets. It trains the HTMClassifier and KNNClassifier on the training data, using the SDRs generated by the SP. After training, the method reconstructs the input values from the test data using the trained classifiers. It computes similarity metrics, such as internal similarity and percentage similarity, to evaluate the reconstruction accuracy. The results are stored in a dictionary and later visualized using the ScottPlot library. This method is the core of the experiment, as it trains the classifiers and evaluates their performance on unseen data.</w:t>
-      </w:r>
-    </w:p>
-    <w:p>
-      <w:pPr>
-        <w:pStyle w:val="Heading3"/>
-        <w:rPr>
-          <w:b/>
-          <w:bCs/>
-        </w:rPr>
-      </w:pPr>
-      <w:r>
-        <w:rPr>
-          <w:b/>
-          <w:bCs/>
-        </w:rPr>
-        <w:t>ReconstructionPart()</w:t>
-      </w:r>
-    </w:p>
-    <w:p/>
-    <w:p>
-      <w:pPr>
-        <w:spacing w:after="160" w:line="259" w:lineRule="auto"/>
-        <w:jc w:val="both"/>
-      </w:pPr>
-      <w:r>
-        <w:t>The </w:t>
-      </w:r>
-      <w:r>
-        <w:t>Reconstruction Part</w:t>
-      </w:r>
-      <w:r>
-        <w:t xml:space="preserve"> method performs the actual reconstruction of input values using the trained classifiers. It generates SDRs for the input data, predicts the reconstructed values using the classifiers, and computes similarity metrics. </w:t>
-      </w:r>
-      <w:r>
-        <w:t>The results are stored in a dictionary and visualized using the ScottPlot library. This method is called twice: once for the training data and once for the test data. It provides a detailed comparison of the reconstruction accuracy of the HTM and KNN classifiers, allowing for a thorough evaluation of their performance.</w:t>
-      </w:r>
-    </w:p>
-    <w:p>
-      <w:pPr>
-        <w:spacing w:after="160" w:line="259" w:lineRule="auto"/>
-        <w:jc w:val="both"/>
-        <w:rPr>
-          <w:b/>
-          <w:bCs/>
-        </w:rPr>
-      </w:pPr>
-    </w:p>
-    <w:p>
-      <w:pPr>
-        <w:pStyle w:val="Heading3"/>
-        <w:rPr>
-          <w:b/>
-          <w:bCs/>
-        </w:rPr>
-      </w:pPr>
-      <w:r>
-        <w:rPr>
-          <w:b/>
-          <w:bCs/>
-        </w:rPr>
         <w:t>CalculatePercentageSimilarity()</w:t>
       </w:r>
     </w:p>
-    <w:p/>
     <w:p>
       <w:pPr>
         <w:spacing w:after="160" w:line="259" w:lineRule="auto"/>
@@ -3735,13 +3957,28 @@
     </w:p>
     <w:p>
       <w:pPr>
+        <w:pStyle w:val="Heading3"/>
+        <w:rPr>
+          <w:b/>
+          <w:bCs/>
+        </w:rPr>
+      </w:pPr>
+      <w:r>
+        <w:rPr>
+          <w:b/>
+          <w:bCs/>
+        </w:rPr>
+        <w:t>PlotReconstructionResults() and PlotSimilarityResults()</w:t>
+      </w:r>
+    </w:p>
+    <w:p>
+      <w:pPr>
         <w:spacing w:after="160" w:line="259" w:lineRule="auto"/>
         <w:jc w:val="both"/>
-        <w:rPr>
-          <w:b/>
-          <w:bCs/>
-        </w:rPr>
-      </w:pPr>
+      </w:pPr>
+      <w:r>
+        <w:t>The PlotReconstructionResults and PlotSimilarityResults methods generate visualizations of the reconstruction results using the ScottPlot library. The PlotReconstructionResults() method creates scatter plots comparing the original input values with the reconstructed values from the HTM and KNN classifiers. The PlotSimilarityResults() method creates line plots comparing the similarity metrics (internal similarity and percentage similarity) of the HTM and KNN classifiers. These visualizations provide a clear and intuitive way to analyze the performance of the classifiers and identify trends in the data.</w:t>
+      </w:r>
     </w:p>
     <w:p>
       <w:pPr>
@@ -3756,111 +3993,68 @@
           <w:b/>
           <w:bCs/>
         </w:rPr>
-        <w:t>PlotReconstructionResults() and PlotSimilarityResults()</w:t>
-      </w:r>
-    </w:p>
-    <w:p/>
+        <w:t>SavePlot(Plot plot, string fileName, double max)</w:t>
+      </w:r>
+    </w:p>
     <w:p>
       <w:pPr>
         <w:spacing w:after="160" w:line="259" w:lineRule="auto"/>
         <w:jc w:val="both"/>
       </w:pPr>
       <w:r>
-        <w:t>The PlotReconstructionResults and PlotSimilarityResults methods generate visualizations of the reconstruction results using the ScottPlot library. The PlotReconstructionResults() method creates scatter plots comparing the original input values with the reconstructed values from the HTM and KNN classifiers. The PlotSimilarityResults() method creates line plots comparing the similarity metrics (internal similarity and percentage similarity) of the HTM and KNN classifiers. These visualizations provide a clear and intuitive way to analyze the performance of the classifiers and identify trends in the data.</w:t>
+        <w:t>The SavePlot method saves the generated plots to the desktop in a cross-platform compatible way. The plot dimensions are dynamically adjusted based on the range of input values. This method ensures that the visualizations are saved in a consistent format and can be easily accessed for further analysis. The plots are saved as PNG files, with filenames indicating the type of dataset (training or testing) and the classifier used (HTM or KNN).</w:t>
+      </w:r>
+    </w:p>
+    <w:p>
+      <w:pPr>
+        <w:pStyle w:val="Heading1"/>
+        <w:rPr>
+          <w:b/>
+          <w:bCs/>
+        </w:rPr>
+      </w:pPr>
+      <w:r>
+        <w:rPr>
+          <w:b/>
+          <w:bCs/>
+        </w:rPr>
+        <w:t>Unit</w:t>
+      </w:r>
+      <w:r>
+        <w:rPr>
+          <w:b/>
+          <w:bCs/>
+        </w:rPr>
+        <w:t>-Testing</w:t>
       </w:r>
     </w:p>
     <w:p>
       <w:pPr>
         <w:spacing w:after="160" w:line="259" w:lineRule="auto"/>
         <w:jc w:val="both"/>
-      </w:pPr>
-    </w:p>
-    <w:p>
-      <w:pPr>
-        <w:pStyle w:val="Heading3"/>
-        <w:rPr>
-          <w:b/>
-          <w:bCs/>
-        </w:rPr>
-      </w:pPr>
-      <w:r>
-        <w:rPr>
-          <w:b/>
-          <w:bCs/>
-        </w:rPr>
-        <w:t>SavePlot(Plot plot, string fileName, double max)</w:t>
-      </w:r>
-    </w:p>
-    <w:p/>
-    <w:p>
-      <w:pPr>
-        <w:spacing w:after="160" w:line="259" w:lineRule="auto"/>
-        <w:jc w:val="both"/>
-      </w:pPr>
-      <w:r>
-        <w:t>The SavePlot method saves the generated plots to the desktop in a cross-platform compatible way. The plot dimensions are dynamically adjusted based on the range of input values. This method ensures that the visualizations are saved in a consistent format and can be easily accessed for further analysis. The plots are saved as PNG files, with filenames indicating the type of dataset (training or testing) and the classifier used (HTM or KNN).</w:t>
-      </w:r>
-    </w:p>
-    <w:p>
-      <w:pPr>
-        <w:jc w:val="both"/>
-        <w:rPr>
-          <w:spacing w:val="-1"/>
-          <w:lang w:eastAsia="x-none"/>
-        </w:rPr>
-      </w:pPr>
-    </w:p>
-    <w:p>
-      <w:pPr>
-        <w:jc w:val="both"/>
-        <w:rPr>
-          <w:spacing w:val="-1"/>
-          <w:lang w:eastAsia="x-none"/>
-        </w:rPr>
-      </w:pPr>
-    </w:p>
-    <w:p>
-      <w:pPr>
-        <w:pStyle w:val="Heading1"/>
-        <w:rPr>
-          <w:b/>
-          <w:bCs/>
-        </w:rPr>
-      </w:pPr>
-      <w:r>
-        <w:rPr>
-          <w:b/>
-          <w:bCs/>
-        </w:rPr>
-        <w:lastRenderedPageBreak/>
-        <w:t>Unit</w:t>
-      </w:r>
-      <w:r>
-        <w:rPr>
-          <w:b/>
-          <w:bCs/>
-        </w:rPr>
-        <w:t>-Testing</w:t>
-      </w:r>
-    </w:p>
-    <w:p>
-      <w:pPr>
-        <w:jc w:val="both"/>
-      </w:pPr>
-    </w:p>
-    <w:p>
-      <w:pPr>
-        <w:spacing w:after="160" w:line="259" w:lineRule="auto"/>
-        <w:jc w:val="both"/>
-        <w:rPr>
-          <w:rFonts w:cstheme="minorHAnsi"/>
-        </w:rPr>
-      </w:pPr>
-      <w:r>
-        <w:rPr>
-          <w:rFonts w:cstheme="minorHAnsi"/>
-        </w:rPr>
-        <w:t>Unit testing is a critical component of software development, ensuring that individual components of the system function as expected. In this study, unit tests were developed to validate the functionality of the SpatialPoolerInputReconstructionExperiment class, which is responsible for encoding inputs, training the Spatial Pooler, and reconstructing inputs using HTM and KNN classifiers. The unit tests were implemented using the Microsoft.VisualStudio.TestTools.UnitTesting framework in C# and were designed to verify the correctness of the experiment's execution, the training of the Spatial Pooler, and the input reconstruction process.</w:t>
+        <w:rPr>
+          <w:rFonts w:cstheme="minorHAnsi"/>
+        </w:rPr>
+      </w:pPr>
+      <w:r>
+        <w:rPr>
+          <w:rFonts w:cstheme="minorHAnsi"/>
+        </w:rPr>
+        <w:t>Unit testing is a critical component of software development, ensuring that individual components of the system function as expected. In this study, unit tests were developed to validate the functionality of the SpatialPoolerInputReconstructionExperiment class, which is responsible for encoding inputs, training the Spatial Pooler, and reconstructing inputs using HTM and KNN classifiers. The unit tests were implemented using the </w:t>
+      </w:r>
+      <w:proofErr w:type="gramStart"/>
+      <w:r>
+        <w:rPr>
+          <w:rFonts w:cstheme="minorHAnsi"/>
+        </w:rPr>
+        <w:t>Microsoft.VisualStudio.TestTools.UnitTesting</w:t>
+      </w:r>
+      <w:proofErr w:type="gramEnd"/>
+      <w:r>
+        <w:rPr>
+          <w:rFonts w:cstheme="minorHAnsi"/>
+        </w:rPr>
+        <w:t> framework in C# and were designed to verify the correctness of the experiment's execution, the training of the Spatial Pooler, and the input reconstruction process.</w:t>
       </w:r>
     </w:p>
     <w:p>
@@ -3879,10 +4073,9 @@
         <w:t>Unit Test Objectives</w:t>
       </w:r>
     </w:p>
-    <w:p/>
-    <w:p>
-      <w:pPr>
-        <w:spacing w:after="160" w:line="259" w:lineRule="auto"/>
+    <w:p>
+      <w:pPr>
+        <w:spacing w:line="259" w:lineRule="auto"/>
         <w:jc w:val="both"/>
         <w:rPr>
           <w:rFonts w:cstheme="minorHAnsi"/>
@@ -3901,7 +4094,7 @@
           <w:ilvl w:val="0"/>
           <w:numId w:val="22"/>
         </w:numPr>
-        <w:spacing w:after="160" w:line="259" w:lineRule="auto"/>
+        <w:spacing w:line="259" w:lineRule="auto"/>
         <w:jc w:val="both"/>
         <w:rPr>
           <w:rFonts w:cstheme="minorHAnsi"/>
@@ -3920,7 +4113,7 @@
           <w:ilvl w:val="0"/>
           <w:numId w:val="22"/>
         </w:numPr>
-        <w:spacing w:after="160" w:line="259" w:lineRule="auto"/>
+        <w:spacing w:line="259" w:lineRule="auto"/>
         <w:jc w:val="both"/>
         <w:rPr>
           <w:rFonts w:cstheme="minorHAnsi"/>
@@ -3955,21 +4148,6 @@
         </w:rPr>
         <w:br/>
       </w:r>
-      <w:r>
-        <w:rPr>
-          <w:rFonts w:cstheme="minorHAnsi"/>
-        </w:rPr>
-        <w:br/>
-      </w:r>
-    </w:p>
-    <w:p>
-      <w:pPr>
-        <w:jc w:val="both"/>
-        <w:rPr>
-          <w:spacing w:val="-1"/>
-          <w:lang w:eastAsia="x-none"/>
-        </w:rPr>
-      </w:pPr>
     </w:p>
     <w:p>
       <w:pPr>
@@ -4103,7 +4281,16 @@
           <w:sz w:val="20"/>
           <w:szCs w:val="20"/>
         </w:rPr>
-        <w:t>The experiment is executed with a valid input parameter (max =&gt; 10). The test observes whether the method completes its entire workflow, including SP training, input reconstruction, and classifier evaluation, without throwing exceptions. This simulates a minimal viable execution of the experiment.</w:t>
+        <w:t xml:space="preserve">The experiment is executed with a valid input parameter (max =&gt; 10). The test observes whether the method completes its entire workflow, including SP training, input reconstruction, and </w:t>
+      </w:r>
+      <w:r>
+        <w:rPr>
+          <w:rFonts w:ascii="Times New Roman" w:hAnsi="Times New Roman"/>
+          <w:sz w:val="20"/>
+          <w:szCs w:val="20"/>
+        </w:rPr>
+        <w:lastRenderedPageBreak/>
+        <w:t>classifier evaluation, without throwing exceptions. This simulates a minimal viable execution of the experiment.</w:t>
       </w:r>
       <w:r>
         <w:rPr>
@@ -4227,23 +4414,6 @@
     </w:p>
     <w:p>
       <w:pPr>
-        <w:spacing w:after="160" w:line="259" w:lineRule="auto"/>
-        <w:jc w:val="both"/>
-        <w:rPr>
-          <w:b/>
-          <w:bCs/>
-        </w:rPr>
-      </w:pPr>
-      <w:r>
-        <w:rPr>
-          <w:b/>
-          <w:bCs/>
-        </w:rPr>
-        <w:t> </w:t>
-      </w:r>
-    </w:p>
-    <w:p>
-      <w:pPr>
         <w:pStyle w:val="Heading3"/>
         <w:jc w:val="left"/>
         <w:rPr>
@@ -4468,23 +4638,6 @@
     </w:p>
     <w:p>
       <w:pPr>
-        <w:spacing w:after="160" w:line="259" w:lineRule="auto"/>
-        <w:jc w:val="both"/>
-        <w:rPr>
-          <w:b/>
-          <w:bCs/>
-        </w:rPr>
-      </w:pPr>
-      <w:r>
-        <w:rPr>
-          <w:b/>
-          <w:bCs/>
-        </w:rPr>
-        <w:t> </w:t>
-      </w:r>
-    </w:p>
-    <w:p>
-      <w:pPr>
         <w:pStyle w:val="Heading3"/>
         <w:jc w:val="left"/>
         <w:rPr>
@@ -4579,7 +4732,6 @@
           <w:sz w:val="20"/>
           <w:szCs w:val="20"/>
         </w:rPr>
-        <w:lastRenderedPageBreak/>
         <w:t>Test Scenario </w:t>
       </w:r>
       <w:r>
@@ -4652,7 +4804,25 @@
           <w:sz w:val="20"/>
           <w:szCs w:val="20"/>
         </w:rPr>
-        <w:t>The test checks if the console output contains the stability message. If present, it confirms the SP has converged to a stable state, validating that the training process is functioning as designed.</w:t>
+        <w:t xml:space="preserve">The test checks if the console output contains the stability message. If present, it confirms the SP has </w:t>
+      </w:r>
+      <w:proofErr w:type="spellStart"/>
+      <w:r>
+        <w:rPr>
+          <w:rFonts w:ascii="Times New Roman" w:hAnsi="Times New Roman"/>
+          <w:sz w:val="20"/>
+          <w:szCs w:val="20"/>
+        </w:rPr>
+        <w:t>converged</w:t>
+      </w:r>
+      <w:proofErr w:type="spellEnd"/>
+      <w:r>
+        <w:rPr>
+          <w:rFonts w:ascii="Times New Roman" w:hAnsi="Times New Roman"/>
+          <w:sz w:val="20"/>
+          <w:szCs w:val="20"/>
+        </w:rPr>
+        <w:t xml:space="preserve"> to a stable state, validating that the training process is functioning as designed.</w:t>
       </w:r>
       <w:r>
         <w:rPr>
@@ -4730,23 +4900,6 @@
     </w:p>
     <w:p>
       <w:pPr>
-        <w:spacing w:after="160" w:line="259" w:lineRule="auto"/>
-        <w:jc w:val="both"/>
-        <w:rPr>
-          <w:b/>
-          <w:bCs/>
-        </w:rPr>
-      </w:pPr>
-      <w:r>
-        <w:rPr>
-          <w:b/>
-          <w:bCs/>
-        </w:rPr>
-        <w:t> </w:t>
-      </w:r>
-    </w:p>
-    <w:p>
-      <w:pPr>
         <w:pStyle w:val="Heading3"/>
         <w:jc w:val="left"/>
         <w:rPr>
@@ -4984,45 +5137,7 @@
     </w:p>
     <w:p>
       <w:pPr>
-        <w:spacing w:after="160" w:line="259" w:lineRule="auto"/>
-        <w:jc w:val="both"/>
-        <w:rPr>
-          <w:b/>
-          <w:bCs/>
-        </w:rPr>
-      </w:pPr>
-      <w:r>
-        <w:rPr>
-          <w:b/>
-          <w:bCs/>
-        </w:rPr>
-        <w:t> </w:t>
-      </w:r>
-    </w:p>
-    <w:p>
-      <w:pPr>
         <w:pStyle w:val="Heading3"/>
-        <w:jc w:val="left"/>
-        <w:rPr>
-          <w:b/>
-          <w:bCs/>
-        </w:rPr>
-      </w:pPr>
-      <w:r>
-        <w:rPr>
-          <w:b/>
-          <w:bCs/>
-        </w:rPr>
-        <w:t>Test Case 5: Test_ReconstructionPart_Results_Have_Valid_Similarity</w:t>
-      </w:r>
-    </w:p>
-    <w:p>
-      <w:pPr>
-        <w:pStyle w:val="Heading3"/>
-        <w:numPr>
-          <w:ilvl w:val="0"/>
-          <w:numId w:val="0"/>
-        </w:numPr>
         <w:ind w:left="288"/>
         <w:jc w:val="left"/>
         <w:rPr>
@@ -5035,7 +5150,7 @@
           <w:b/>
           <w:bCs/>
         </w:rPr>
-        <w:t> </w:t>
+        <w:t>Test Case 5: Test_ReconstructionPart_Results_Have_Valid_Similarity</w:t>
       </w:r>
     </w:p>
     <w:p>
@@ -5122,7 +5237,32 @@
           <w:sz w:val="20"/>
           <w:szCs w:val="20"/>
         </w:rPr>
-        <w:t>After reconstruction, the similarity values stored in experiment.Results are checked. Each value must be ≥0 and ≤1, as similarity is calculated as the overlap ratio between original and reconstructed inputs.</w:t>
+        <w:t>After reconstruction, the similarity values stored in experiment.</w:t>
+      </w:r>
+      <w:r>
+        <w:rPr>
+          <w:rFonts w:ascii="Times New Roman" w:hAnsi="Times New Roman"/>
+          <w:sz w:val="20"/>
+          <w:szCs w:val="20"/>
+        </w:rPr>
+        <w:t xml:space="preserve"> </w:t>
+      </w:r>
+      <w:r>
+        <w:rPr>
+          <w:rFonts w:ascii="Times New Roman" w:hAnsi="Times New Roman"/>
+          <w:sz w:val="20"/>
+          <w:szCs w:val="20"/>
+        </w:rPr>
+        <w:t xml:space="preserve">Results are checked. Each value must be ≥0 and ≤1, as similarity is calculated as the </w:t>
+      </w:r>
+      <w:r>
+        <w:rPr>
+          <w:rFonts w:ascii="Times New Roman" w:hAnsi="Times New Roman"/>
+          <w:sz w:val="20"/>
+          <w:szCs w:val="20"/>
+        </w:rPr>
+        <w:lastRenderedPageBreak/>
+        <w:t>overlap ratio between original and reconstructed inputs.</w:t>
       </w:r>
       <w:r>
         <w:rPr>
@@ -5246,23 +5386,6 @@
     </w:p>
     <w:p>
       <w:pPr>
-        <w:spacing w:after="160" w:line="259" w:lineRule="auto"/>
-        <w:jc w:val="both"/>
-        <w:rPr>
-          <w:b/>
-          <w:bCs/>
-        </w:rPr>
-      </w:pPr>
-      <w:r>
-        <w:rPr>
-          <w:b/>
-          <w:bCs/>
-        </w:rPr>
-        <w:t> </w:t>
-      </w:r>
-    </w:p>
-    <w:p>
-      <w:pPr>
         <w:pStyle w:val="Heading2"/>
         <w:rPr>
           <w:b/>
@@ -5340,7 +5463,6 @@
         <w:t>Importance of Unit Testing</w:t>
       </w:r>
     </w:p>
-    <w:p/>
     <w:p>
       <w:pPr>
         <w:jc w:val="both"/>
@@ -5355,7 +5477,7 @@
           <w:ilvl w:val="0"/>
           <w:numId w:val="31"/>
         </w:numPr>
-        <w:spacing w:after="160" w:line="259" w:lineRule="auto"/>
+        <w:spacing w:line="259" w:lineRule="auto"/>
         <w:jc w:val="both"/>
       </w:pPr>
       <w:r>
@@ -5368,7 +5490,7 @@
           <w:ilvl w:val="0"/>
           <w:numId w:val="31"/>
         </w:numPr>
-        <w:spacing w:after="160" w:line="259" w:lineRule="auto"/>
+        <w:spacing w:line="259" w:lineRule="auto"/>
         <w:jc w:val="both"/>
       </w:pPr>
       <w:r>
@@ -5381,7 +5503,7 @@
           <w:ilvl w:val="0"/>
           <w:numId w:val="31"/>
         </w:numPr>
-        <w:spacing w:after="160" w:line="259" w:lineRule="auto"/>
+        <w:spacing w:line="259" w:lineRule="auto"/>
         <w:jc w:val="both"/>
       </w:pPr>
       <w:r>
@@ -5401,7 +5523,6 @@
           <w:b/>
           <w:bCs/>
         </w:rPr>
-        <w:lastRenderedPageBreak/>
         <w:t>Future Unit Testing Enhancements</w:t>
       </w:r>
     </w:p>
@@ -5411,6 +5532,58 @@
       </w:pPr>
       <w:r>
         <w:t>While the current unit tests cover the core functionality of the experiment, there are opportunities for further enhancement:</w:t>
+      </w:r>
+    </w:p>
+    <w:p>
+      <w:pPr>
+        <w:numPr>
+          <w:ilvl w:val="0"/>
+          <w:numId w:val="25"/>
+        </w:numPr>
+        <w:spacing w:line="259" w:lineRule="auto"/>
+        <w:jc w:val="both"/>
+      </w:pPr>
+      <w:r>
+        <w:t>Test Edge Cases: Additional tests could be added to validate the experiment's behavior with edge cases, such as:</w:t>
+      </w:r>
+    </w:p>
+    <w:p>
+      <w:pPr>
+        <w:numPr>
+          <w:ilvl w:val="1"/>
+          <w:numId w:val="25"/>
+        </w:numPr>
+        <w:spacing w:line="259" w:lineRule="auto"/>
+        <w:jc w:val="both"/>
+      </w:pPr>
+      <w:r>
+        <w:t>Extremely small or large input values.</w:t>
+      </w:r>
+    </w:p>
+    <w:p>
+      <w:pPr>
+        <w:numPr>
+          <w:ilvl w:val="1"/>
+          <w:numId w:val="25"/>
+        </w:numPr>
+        <w:spacing w:line="259" w:lineRule="auto"/>
+        <w:jc w:val="both"/>
+      </w:pPr>
+      <w:r>
+        <w:t>Empty or null input datasets.</w:t>
+      </w:r>
+    </w:p>
+    <w:p>
+      <w:pPr>
+        <w:numPr>
+          <w:ilvl w:val="1"/>
+          <w:numId w:val="25"/>
+        </w:numPr>
+        <w:spacing w:line="259" w:lineRule="auto"/>
+        <w:jc w:val="both"/>
+      </w:pPr>
+      <w:r>
+        <w:t>Non-numeric input values (if applicable).</w:t>
       </w:r>
     </w:p>
     <w:p>
@@ -5423,46 +5596,7 @@
         <w:jc w:val="both"/>
       </w:pPr>
       <w:r>
-        <w:t>Test Edge Cases: Additional tests could be added to validate the experiment's behavior with edge cases, such as:</w:t>
-      </w:r>
-    </w:p>
-    <w:p>
-      <w:pPr>
-        <w:numPr>
-          <w:ilvl w:val="1"/>
-          <w:numId w:val="25"/>
-        </w:numPr>
-        <w:spacing w:after="160" w:line="259" w:lineRule="auto"/>
-        <w:jc w:val="both"/>
-      </w:pPr>
-      <w:r>
-        <w:t>Extremely small or large input values.</w:t>
-      </w:r>
-    </w:p>
-    <w:p>
-      <w:pPr>
-        <w:numPr>
-          <w:ilvl w:val="1"/>
-          <w:numId w:val="25"/>
-        </w:numPr>
-        <w:spacing w:after="160" w:line="259" w:lineRule="auto"/>
-        <w:jc w:val="both"/>
-      </w:pPr>
-      <w:r>
-        <w:t>Empty or null input datasets.</w:t>
-      </w:r>
-    </w:p>
-    <w:p>
-      <w:pPr>
-        <w:numPr>
-          <w:ilvl w:val="1"/>
-          <w:numId w:val="25"/>
-        </w:numPr>
-        <w:spacing w:after="160" w:line="259" w:lineRule="auto"/>
-        <w:jc w:val="both"/>
-      </w:pPr>
-      <w:r>
-        <w:t>Non-numeric input values (if applicable).</w:t>
+        <w:t>Performance Testing: Unit tests could be extended to measure the performance of the Spatial Pooler and classifiers, ensuring that the system scales well with larger datasets.</w:t>
       </w:r>
     </w:p>
     <w:p>
@@ -5475,7 +5609,7 @@
         <w:jc w:val="both"/>
       </w:pPr>
       <w:r>
-        <w:t>Performance Testing: Unit tests could be extended to measure the performance of the Spatial Pooler and classifiers, ensuring that the system scales well with larger datasets.</w:t>
+        <w:t>Integration Testing: While unit tests focus on individual components, integration tests could be developed to verify the interaction between different modules (e.g., encoding, Spatial Pooler, and classifiers).</w:t>
       </w:r>
     </w:p>
     <w:p>
@@ -5488,19 +5622,6 @@
         <w:jc w:val="both"/>
       </w:pPr>
       <w:r>
-        <w:t>Integration Testing: While unit tests focus on individual components, integration tests could be developed to verify the interaction between different modules (e.g., encoding, Spatial Pooler, and classifiers).</w:t>
-      </w:r>
-    </w:p>
-    <w:p>
-      <w:pPr>
-        <w:numPr>
-          <w:ilvl w:val="0"/>
-          <w:numId w:val="25"/>
-        </w:numPr>
-        <w:spacing w:after="160" w:line="259" w:lineRule="auto"/>
-        <w:jc w:val="both"/>
-      </w:pPr>
-      <w:r>
         <w:t>Automated Testing: The unit tests could be integrated into a continuous integration (CI) pipeline, allowing for automated testing and early detection of regressions.</w:t>
       </w:r>
     </w:p>
@@ -5520,7 +5641,6 @@
         <w:t>Result Analysis</w:t>
       </w:r>
     </w:p>
-    <w:p/>
     <w:p>
       <w:pPr>
         <w:ind w:firstLine="720"/>
@@ -5549,96 +5669,112 @@
           <w:spacing w:val="-1"/>
           <w:lang w:val="en-IN" w:eastAsia="x-none"/>
         </w:rPr>
-        <w:t xml:space="preserve">Classifier and </w:t>
+        <w:t>Classifier and KNN</w:t>
       </w:r>
       <w:r>
         <w:rPr>
           <w:spacing w:val="-1"/>
           <w:lang w:val="en-IN" w:eastAsia="x-none"/>
         </w:rPr>
-        <w:t>KNN</w:t>
+        <w:t xml:space="preserve"> Classifier</w:t>
       </w:r>
       <w:r>
         <w:rPr>
           <w:spacing w:val="-1"/>
           <w:lang w:val="en-IN" w:eastAsia="x-none"/>
         </w:rPr>
-        <w:t xml:space="preserve"> Classifier</w:t>
+        <w:t xml:space="preserve"> in reconstructing scalar inputs across t</w:t>
       </w:r>
       <w:r>
         <w:rPr>
           <w:spacing w:val="-1"/>
           <w:lang w:val="en-IN" w:eastAsia="x-none"/>
         </w:rPr>
-        <w:t xml:space="preserve"> in reconstructing scalar inputs across three ranges (1–20, 1–50, and 1–100), emphasizing reconstruction accuracy, similarity metrics, computational efficiency, and the interplay between Spatial Pooler (SP)-generated Sparse Distributed Representations (SDRs) and classifier </w:t>
+        <w:t>wo</w:t>
       </w:r>
       <w:r>
         <w:rPr>
           <w:spacing w:val="-1"/>
           <w:lang w:val="en-IN" w:eastAsia="x-none"/>
         </w:rPr>
-        <w:t>behaviour</w:t>
+        <w:t xml:space="preserve"> ranges (1–20</w:t>
       </w:r>
       <w:r>
         <w:rPr>
           <w:spacing w:val="-1"/>
           <w:lang w:val="en-IN" w:eastAsia="x-none"/>
         </w:rPr>
-        <w:t>. Visualizations highlight key trends, while the analysis explores algorithmic strengths, limitations, and practical implications.</w:t>
-      </w:r>
-    </w:p>
-    <w:p>
-      <w:pPr>
-        <w:ind w:firstLine="720"/>
-        <w:jc w:val="both"/>
+        <w:t xml:space="preserve"> and </w:t>
+      </w:r>
+      <w:r>
         <w:rPr>
           <w:spacing w:val="-1"/>
           <w:lang w:val="en-IN" w:eastAsia="x-none"/>
         </w:rPr>
-      </w:pPr>
+        <w:t>1–50), emphasizing reconstruction accuracy, similarity metrics, computational efficiency, and the interplay between Spatial Pooler (SP)-generated Sparse Distributed Representations (SDRs) and classifier behaviour. Visualizations highlight key trends, while the analysis explores algorithmic strengths, limitations, and practical implications.</w:t>
+      </w:r>
     </w:p>
     <w:p>
       <w:pPr>
         <w:pStyle w:val="Heading2"/>
         <w:rPr>
+          <w:b/>
+          <w:bCs/>
+          <w:i w:val="0"/>
+          <w:iCs w:val="0"/>
+          <w:lang w:val="en-IN" w:eastAsia="x-none"/>
+        </w:rPr>
+      </w:pPr>
+      <w:r>
+        <w:rPr>
           <w:rStyle w:val="Heading2Char"/>
           <w:b/>
           <w:bCs/>
           <w:lang w:val="en-IN" w:eastAsia="x-none"/>
         </w:rPr>
-      </w:pPr>
-      <w:r>
-        <w:rPr>
-          <w:rStyle w:val="Heading2Char"/>
-          <w:b/>
-          <w:bCs/>
+        <w:t>Case 1 : Inputs 1–20</w:t>
+      </w:r>
+    </w:p>
+    <w:p>
+      <w:pPr>
+        <w:pStyle w:val="Heading3"/>
+        <w:rPr>
+          <w:b/>
+          <w:bCs/>
+          <w:lang w:val="en-IN"/>
+        </w:rPr>
+      </w:pPr>
+      <w:r>
+        <w:rPr>
+          <w:lang w:val="en-IN"/>
+        </w:rPr>
+        <w:t xml:space="preserve"> </w:t>
+      </w:r>
+      <w:r>
+        <w:rPr>
+          <w:b/>
+          <w:bCs/>
+          <w:lang w:val="en-IN"/>
+        </w:rPr>
+        <w:t>Training Data Reconstruction</w:t>
+      </w:r>
+    </w:p>
+    <w:p>
+      <w:pPr>
+        <w:jc w:val="both"/>
+        <w:rPr>
           <w:lang w:val="en-IN" w:eastAsia="x-none"/>
         </w:rPr>
-        <w:t>Case 1</w:t>
-      </w:r>
-      <w:r>
-        <w:rPr>
-          <w:rStyle w:val="Heading2Char"/>
-          <w:b/>
-          <w:bCs/>
+      </w:pPr>
+      <w:r>
+        <w:rPr>
           <w:lang w:val="en-IN" w:eastAsia="x-none"/>
         </w:rPr>
-        <w:t xml:space="preserve"> </w:t>
-      </w:r>
-      <w:r>
-        <w:rPr>
-          <w:rStyle w:val="Heading2Char"/>
-          <w:b/>
-          <w:bCs/>
-          <w:lang w:val="en-IN" w:eastAsia="x-none"/>
-        </w:rPr>
-        <w:t>: Inputs 1–20</w:t>
-      </w:r>
-    </w:p>
-    <w:p>
-      <w:pPr>
-        <w:ind w:firstLine="720"/>
-        <w:jc w:val="both"/>
+        <w:t>Both the HTM and KNN classifiers achieved perfect reconstruction accuracy (100% similarity) on the training dataset (80% split), as demonstrated in Figure 1 (Train_KNN_ReconstructionPlot.png) and Figure 2 (Train_HTM_ReconstructionPlot.png). Predictions align perfectly with the input values along the diagonal, indicating robust memorization of training patterns. This performance, however, highlights a potential risk of overfitting, where models excel on known data but struggle with generalization.</w:t>
+      </w:r>
+    </w:p>
+    <w:p>
+      <w:pPr>
         <w:rPr>
           <w:spacing w:val="-1"/>
           <w:lang w:val="en-IN" w:eastAsia="x-none"/>
@@ -5646,6 +5782,549 @@
       </w:pPr>
       <w:r>
         <w:rPr>
+          <w:noProof/>
+        </w:rPr>
+        <w:drawing>
+          <wp:inline distT="0" distB="0" distL="0" distR="0" wp14:anchorId="20B3D0F2" wp14:editId="6C1DD303">
+            <wp:extent cx="3005672" cy="2708563"/>
+            <wp:effectExtent l="0" t="0" r="4445" b="0"/>
+            <wp:docPr id="1184654939" name="Picture 30"/>
+            <wp:cNvGraphicFramePr>
+              <a:graphicFrameLocks xmlns:a="http://schemas.openxmlformats.org/drawingml/2006/main" noChangeAspect="1"/>
+            </wp:cNvGraphicFramePr>
+            <a:graphic xmlns:a="http://schemas.openxmlformats.org/drawingml/2006/main">
+              <a:graphicData uri="http://schemas.openxmlformats.org/drawingml/2006/picture">
+                <pic:pic xmlns:pic="http://schemas.openxmlformats.org/drawingml/2006/picture">
+                  <pic:nvPicPr>
+                    <pic:cNvPr id="0" name="Picture 172"/>
+                    <pic:cNvPicPr>
+                      <a:picLocks noChangeAspect="1" noChangeArrowheads="1"/>
+                    </pic:cNvPicPr>
+                  </pic:nvPicPr>
+                  <pic:blipFill>
+                    <a:blip r:embed="rId24" cstate="print">
+                      <a:extLst>
+                        <a:ext uri="{28A0092B-C50C-407E-A947-70E740481C1C}">
+                          <a14:useLocalDpi xmlns:a14="http://schemas.microsoft.com/office/drawing/2010/main" val="0"/>
+                        </a:ext>
+                      </a:extLst>
+                    </a:blip>
+                    <a:srcRect/>
+                    <a:stretch>
+                      <a:fillRect/>
+                    </a:stretch>
+                  </pic:blipFill>
+                  <pic:spPr bwMode="auto">
+                    <a:xfrm>
+                      <a:off x="0" y="0"/>
+                      <a:ext cx="3075909" cy="2771857"/>
+                    </a:xfrm>
+                    <a:prstGeom prst="rect">
+                      <a:avLst/>
+                    </a:prstGeom>
+                    <a:noFill/>
+                    <a:ln>
+                      <a:noFill/>
+                    </a:ln>
+                  </pic:spPr>
+                </pic:pic>
+              </a:graphicData>
+            </a:graphic>
+          </wp:inline>
+        </w:drawing>
+      </w:r>
+    </w:p>
+    <w:p>
+      <w:pPr>
+        <w:rPr>
+          <w:i/>
+          <w:iCs/>
+          <w:noProof/>
+        </w:rPr>
+      </w:pPr>
+      <w:r>
+        <w:rPr>
+          <w:rStyle w:val="FigureChar"/>
+          <w:i/>
+          <w:iCs/>
+          <w:sz w:val="20"/>
+          <w:lang w:val="en-IN" w:eastAsia="x-none"/>
+        </w:rPr>
+        <w:t>Figure</w:t>
+      </w:r>
+      <w:r>
+        <w:rPr>
+          <w:rStyle w:val="FigureChar"/>
+          <w:i/>
+          <w:iCs/>
+          <w:sz w:val="20"/>
+          <w:lang w:val="en-IN" w:eastAsia="x-none"/>
+        </w:rPr>
+        <w:t>.</w:t>
+      </w:r>
+      <w:r>
+        <w:rPr>
+          <w:rStyle w:val="FigureChar"/>
+          <w:i/>
+          <w:iCs/>
+          <w:sz w:val="20"/>
+          <w:lang w:val="en-IN" w:eastAsia="x-none"/>
+        </w:rPr>
+        <w:t>1 Train_KNN_ReconstructionPlot.png</w:t>
+      </w:r>
+    </w:p>
+    <w:p>
+      <w:pPr>
+        <w:rPr>
+          <w:noProof/>
+        </w:rPr>
+      </w:pPr>
+    </w:p>
+    <w:p>
+      <w:pPr>
+        <w:rPr>
+          <w:spacing w:val="-1"/>
+          <w:lang w:val="en-IN" w:eastAsia="x-none"/>
+        </w:rPr>
+      </w:pPr>
+      <w:r>
+        <w:rPr>
+          <w:noProof/>
+        </w:rPr>
+        <w:lastRenderedPageBreak/>
+        <w:drawing>
+          <wp:inline distT="0" distB="0" distL="0" distR="0" wp14:anchorId="2D63A55D" wp14:editId="222AB29B">
+            <wp:extent cx="2951868" cy="2660073"/>
+            <wp:effectExtent l="0" t="0" r="1270" b="6985"/>
+            <wp:docPr id="578264213" name="Picture 29"/>
+            <wp:cNvGraphicFramePr>
+              <a:graphicFrameLocks xmlns:a="http://schemas.openxmlformats.org/drawingml/2006/main" noChangeAspect="1"/>
+            </wp:cNvGraphicFramePr>
+            <a:graphic xmlns:a="http://schemas.openxmlformats.org/drawingml/2006/main">
+              <a:graphicData uri="http://schemas.openxmlformats.org/drawingml/2006/picture">
+                <pic:pic xmlns:pic="http://schemas.openxmlformats.org/drawingml/2006/picture">
+                  <pic:nvPicPr>
+                    <pic:cNvPr id="0" name="Picture 171"/>
+                    <pic:cNvPicPr>
+                      <a:picLocks noChangeAspect="1" noChangeArrowheads="1"/>
+                    </pic:cNvPicPr>
+                  </pic:nvPicPr>
+                  <pic:blipFill>
+                    <a:blip r:embed="rId25" cstate="print">
+                      <a:extLst>
+                        <a:ext uri="{28A0092B-C50C-407E-A947-70E740481C1C}">
+                          <a14:useLocalDpi xmlns:a14="http://schemas.microsoft.com/office/drawing/2010/main" val="0"/>
+                        </a:ext>
+                      </a:extLst>
+                    </a:blip>
+                    <a:srcRect/>
+                    <a:stretch>
+                      <a:fillRect/>
+                    </a:stretch>
+                  </pic:blipFill>
+                  <pic:spPr bwMode="auto">
+                    <a:xfrm>
+                      <a:off x="0" y="0"/>
+                      <a:ext cx="3010848" cy="2713223"/>
+                    </a:xfrm>
+                    <a:prstGeom prst="rect">
+                      <a:avLst/>
+                    </a:prstGeom>
+                    <a:noFill/>
+                    <a:ln>
+                      <a:noFill/>
+                    </a:ln>
+                  </pic:spPr>
+                </pic:pic>
+              </a:graphicData>
+            </a:graphic>
+          </wp:inline>
+        </w:drawing>
+      </w:r>
+    </w:p>
+    <w:p>
+      <w:pPr>
+        <w:pStyle w:val="Figure"/>
+        <w:jc w:val="center"/>
+        <w:rPr>
+          <w:i/>
+          <w:iCs/>
+          <w:sz w:val="20"/>
+          <w:lang w:val="en-IN"/>
+        </w:rPr>
+      </w:pPr>
+      <w:r>
+        <w:rPr>
+          <w:i/>
+          <w:iCs/>
+          <w:sz w:val="20"/>
+          <w:lang w:val="en-IN"/>
+        </w:rPr>
+        <w:t>Figure</w:t>
+      </w:r>
+      <w:r>
+        <w:rPr>
+          <w:i/>
+          <w:iCs/>
+          <w:sz w:val="20"/>
+          <w:lang w:val="en-IN"/>
+        </w:rPr>
+        <w:t>.</w:t>
+      </w:r>
+      <w:r>
+        <w:rPr>
+          <w:i/>
+          <w:iCs/>
+          <w:sz w:val="20"/>
+          <w:lang w:val="en-IN"/>
+        </w:rPr>
+        <w:t>2 Train_HTM_ReconstructionPlot.png</w:t>
+      </w:r>
+    </w:p>
+    <w:p>
+      <w:pPr>
+        <w:pStyle w:val="Figure"/>
+        <w:rPr>
+          <w:spacing w:val="-1"/>
+          <w:lang w:val="en-IN"/>
+        </w:rPr>
+      </w:pPr>
+    </w:p>
+    <w:p>
+      <w:pPr>
+        <w:pStyle w:val="Heading3"/>
+        <w:rPr>
+          <w:b/>
+          <w:bCs/>
+          <w:lang w:val="en-IN"/>
+        </w:rPr>
+      </w:pPr>
+      <w:r>
+        <w:rPr>
+          <w:b/>
+          <w:bCs/>
+          <w:lang w:val="en-IN"/>
+        </w:rPr>
+        <w:t>Testing Data Reconstruction</w:t>
+      </w:r>
+    </w:p>
+    <w:p>
+      <w:pPr>
+        <w:jc w:val="both"/>
+        <w:rPr>
+          <w:noProof/>
+          <w:lang w:val="en-IN" w:eastAsia="x-none"/>
+        </w:rPr>
+      </w:pPr>
+      <w:r>
+        <w:rPr>
+          <w:noProof/>
+          <w:lang w:val="en-IN" w:eastAsia="x-none"/>
+        </w:rPr>
+        <w:t>On the unseen test dataset (20% split), both classifiers exhibited deviations. Figure 3 (Test_KNN_ReconstructionPlot.png) shows KNN predictions scattering slightly from the ideal diagonal, particularly at higher inputs (15–20). In contrast, Figure 4 (Test_HTM_ReconstructionPlot.png) reveals HTM’s predictions clustering closer to the diagonal, with minor discrepancies (e.g., inputs 7 and 16). This suggests HTM’s superior ability to generalize sparse patterns, likely due to its biologically inspired temporal learning mechanism.</w:t>
+      </w:r>
+    </w:p>
+    <w:p>
+      <w:pPr>
+        <w:rPr>
+          <w:i/>
+          <w:iCs/>
+          <w:noProof/>
+          <w:lang w:val="en-IN"/>
+        </w:rPr>
+      </w:pPr>
+      <w:r>
+        <w:rPr>
+          <w:noProof/>
+        </w:rPr>
+        <w:drawing>
+          <wp:inline distT="0" distB="0" distL="0" distR="0" wp14:anchorId="41F94ED2" wp14:editId="78CD5D8B">
+            <wp:extent cx="3082636" cy="2777919"/>
+            <wp:effectExtent l="0" t="0" r="3810" b="3810"/>
+            <wp:docPr id="1543907667" name="Picture 31"/>
+            <wp:cNvGraphicFramePr>
+              <a:graphicFrameLocks xmlns:a="http://schemas.openxmlformats.org/drawingml/2006/main" noChangeAspect="1"/>
+            </wp:cNvGraphicFramePr>
+            <a:graphic xmlns:a="http://schemas.openxmlformats.org/drawingml/2006/main">
+              <a:graphicData uri="http://schemas.openxmlformats.org/drawingml/2006/picture">
+                <pic:pic xmlns:pic="http://schemas.openxmlformats.org/drawingml/2006/picture">
+                  <pic:nvPicPr>
+                    <pic:cNvPr id="0" name="Picture 175"/>
+                    <pic:cNvPicPr>
+                      <a:picLocks noChangeAspect="1" noChangeArrowheads="1"/>
+                    </pic:cNvPicPr>
+                  </pic:nvPicPr>
+                  <pic:blipFill>
+                    <a:blip r:embed="rId26" cstate="print">
+                      <a:extLst>
+                        <a:ext uri="{28A0092B-C50C-407E-A947-70E740481C1C}">
+                          <a14:useLocalDpi xmlns:a14="http://schemas.microsoft.com/office/drawing/2010/main" val="0"/>
+                        </a:ext>
+                      </a:extLst>
+                    </a:blip>
+                    <a:srcRect/>
+                    <a:stretch>
+                      <a:fillRect/>
+                    </a:stretch>
+                  </pic:blipFill>
+                  <pic:spPr bwMode="auto">
+                    <a:xfrm>
+                      <a:off x="0" y="0"/>
+                      <a:ext cx="3095345" cy="2789372"/>
+                    </a:xfrm>
+                    <a:prstGeom prst="rect">
+                      <a:avLst/>
+                    </a:prstGeom>
+                    <a:noFill/>
+                    <a:ln>
+                      <a:noFill/>
+                    </a:ln>
+                  </pic:spPr>
+                </pic:pic>
+              </a:graphicData>
+            </a:graphic>
+          </wp:inline>
+        </w:drawing>
+      </w:r>
+    </w:p>
+    <w:p>
+      <w:pPr>
+        <w:rPr>
+          <w:noProof/>
+          <w:lang w:val="en-IN"/>
+        </w:rPr>
+      </w:pPr>
+      <w:r>
+        <w:rPr>
+          <w:i/>
+          <w:iCs/>
+          <w:noProof/>
+          <w:lang w:val="en-IN"/>
+        </w:rPr>
+        <w:t>Figure</w:t>
+      </w:r>
+      <w:r>
+        <w:rPr>
+          <w:i/>
+          <w:iCs/>
+          <w:noProof/>
+          <w:lang w:val="en-IN"/>
+        </w:rPr>
+        <w:t>.</w:t>
+      </w:r>
+      <w:r>
+        <w:rPr>
+          <w:i/>
+          <w:iCs/>
+          <w:noProof/>
+          <w:lang w:val="en-IN"/>
+        </w:rPr>
+        <w:t>3 Test_KNN_ReconstructionPlot.png</w:t>
+      </w:r>
+    </w:p>
+    <w:p>
+      <w:pPr>
+        <w:pStyle w:val="Figure"/>
+        <w:jc w:val="center"/>
+        <w:rPr>
+          <w:noProof/>
+          <w:lang w:val="en-IN"/>
+        </w:rPr>
+      </w:pPr>
+      <w:r>
+        <w:rPr>
+          <w:noProof/>
+        </w:rPr>
+        <w:drawing>
+          <wp:inline distT="0" distB="0" distL="0" distR="0" wp14:anchorId="21F9A5B3" wp14:editId="3816BFD4">
+            <wp:extent cx="2909454" cy="2621858"/>
+            <wp:effectExtent l="0" t="0" r="5715" b="7620"/>
+            <wp:docPr id="686586498" name="Picture 32"/>
+            <wp:cNvGraphicFramePr>
+              <a:graphicFrameLocks xmlns:a="http://schemas.openxmlformats.org/drawingml/2006/main" noChangeAspect="1"/>
+            </wp:cNvGraphicFramePr>
+            <a:graphic xmlns:a="http://schemas.openxmlformats.org/drawingml/2006/main">
+              <a:graphicData uri="http://schemas.openxmlformats.org/drawingml/2006/picture">
+                <pic:pic xmlns:pic="http://schemas.openxmlformats.org/drawingml/2006/picture">
+                  <pic:nvPicPr>
+                    <pic:cNvPr id="0" name="Picture 176"/>
+                    <pic:cNvPicPr>
+                      <a:picLocks noChangeAspect="1" noChangeArrowheads="1"/>
+                    </pic:cNvPicPr>
+                  </pic:nvPicPr>
+                  <pic:blipFill>
+                    <a:blip r:embed="rId27" cstate="print">
+                      <a:extLst>
+                        <a:ext uri="{28A0092B-C50C-407E-A947-70E740481C1C}">
+                          <a14:useLocalDpi xmlns:a14="http://schemas.microsoft.com/office/drawing/2010/main" val="0"/>
+                        </a:ext>
+                      </a:extLst>
+                    </a:blip>
+                    <a:srcRect/>
+                    <a:stretch>
+                      <a:fillRect/>
+                    </a:stretch>
+                  </pic:blipFill>
+                  <pic:spPr bwMode="auto">
+                    <a:xfrm>
+                      <a:off x="0" y="0"/>
+                      <a:ext cx="3018118" cy="2719781"/>
+                    </a:xfrm>
+                    <a:prstGeom prst="rect">
+                      <a:avLst/>
+                    </a:prstGeom>
+                    <a:noFill/>
+                    <a:ln>
+                      <a:noFill/>
+                    </a:ln>
+                  </pic:spPr>
+                </pic:pic>
+              </a:graphicData>
+            </a:graphic>
+          </wp:inline>
+        </w:drawing>
+      </w:r>
+    </w:p>
+    <w:p>
+      <w:pPr>
+        <w:pStyle w:val="Figure"/>
+        <w:jc w:val="center"/>
+        <w:rPr>
+          <w:i/>
+          <w:iCs/>
+          <w:sz w:val="20"/>
+        </w:rPr>
+      </w:pPr>
+      <w:r>
+        <w:rPr>
+          <w:i/>
+          <w:iCs/>
+          <w:sz w:val="20"/>
+        </w:rPr>
+        <w:t>Figure</w:t>
+      </w:r>
+      <w:r>
+        <w:rPr>
+          <w:i/>
+          <w:iCs/>
+          <w:sz w:val="20"/>
+        </w:rPr>
+        <w:t>.</w:t>
+      </w:r>
+      <w:r>
+        <w:rPr>
+          <w:i/>
+          <w:iCs/>
+          <w:sz w:val="20"/>
+        </w:rPr>
+        <w:t>4 Test_HTM_ReconstructionPlot.png</w:t>
+      </w:r>
+    </w:p>
+    <w:p>
+      <w:pPr>
+        <w:jc w:val="both"/>
+        <w:rPr>
+          <w:spacing w:val="-1"/>
+          <w:lang w:val="en-IN" w:eastAsia="x-none"/>
+        </w:rPr>
+      </w:pPr>
+    </w:p>
+    <w:p>
+      <w:pPr>
+        <w:pStyle w:val="Heading3"/>
+        <w:rPr>
+          <w:b/>
+          <w:bCs/>
+          <w:lang w:val="en-IN"/>
+        </w:rPr>
+      </w:pPr>
+      <w:r>
+        <w:rPr>
+          <w:b/>
+          <w:bCs/>
+          <w:lang w:val="en-IN"/>
+        </w:rPr>
+        <w:t xml:space="preserve"> Similarity Comparison</w:t>
+      </w:r>
+    </w:p>
+    <w:p>
+      <w:pPr>
+        <w:jc w:val="both"/>
+        <w:rPr>
+          <w:noProof/>
+          <w:lang w:val="en-IN" w:eastAsia="x-none"/>
+        </w:rPr>
+      </w:pPr>
+      <w:r>
+        <w:rPr>
+          <w:noProof/>
+          <w:lang w:val="en-IN" w:eastAsia="x-none"/>
+        </w:rPr>
+        <w:t>The Test_SimilarityPlot.png (Figure 5) highlights HTM’s marginal advantage over KNN, with higher similarity peaks (e.g., inputs 5, 12, 18). For instance, HTM achieved ~95% similarity at input 12 compared to KNN’s ~88%, demonstrating its robustness in reconstructing complex patterns. Conversely, Figure 6 (Train_SimilarityPlot.png) confirms both classifiers achieved 100% similarity on training data, reinforcing their memorization capability.</w:t>
+      </w:r>
+    </w:p>
+    <w:p>
+      <w:pPr>
+        <w:rPr>
+          <w:noProof/>
+          <w:lang w:val="en-IN" w:eastAsia="x-none"/>
+        </w:rPr>
+      </w:pPr>
+      <w:r>
+        <w:rPr>
+          <w:noProof/>
+        </w:rPr>
+        <w:drawing>
+          <wp:inline distT="0" distB="0" distL="0" distR="0" wp14:anchorId="5AEDC10B" wp14:editId="05D69350">
+            <wp:extent cx="3100705" cy="2791654"/>
+            <wp:effectExtent l="0" t="0" r="4445" b="8890"/>
+            <wp:docPr id="809564481" name="Picture 35"/>
+            <wp:cNvGraphicFramePr>
+              <a:graphicFrameLocks xmlns:a="http://schemas.openxmlformats.org/drawingml/2006/main" noChangeAspect="1"/>
+            </wp:cNvGraphicFramePr>
+            <a:graphic xmlns:a="http://schemas.openxmlformats.org/drawingml/2006/main">
+              <a:graphicData uri="http://schemas.openxmlformats.org/drawingml/2006/picture">
+                <pic:pic xmlns:pic="http://schemas.openxmlformats.org/drawingml/2006/picture">
+                  <pic:nvPicPr>
+                    <pic:cNvPr id="0" name="Picture 183"/>
+                    <pic:cNvPicPr>
+                      <a:picLocks noChangeAspect="1" noChangeArrowheads="1"/>
+                    </pic:cNvPicPr>
+                  </pic:nvPicPr>
+                  <pic:blipFill>
+                    <a:blip r:embed="rId28" cstate="print">
+                      <a:extLst>
+                        <a:ext uri="{28A0092B-C50C-407E-A947-70E740481C1C}">
+                          <a14:useLocalDpi xmlns:a14="http://schemas.microsoft.com/office/drawing/2010/main" val="0"/>
+                        </a:ext>
+                      </a:extLst>
+                    </a:blip>
+                    <a:srcRect/>
+                    <a:stretch>
+                      <a:fillRect/>
+                    </a:stretch>
+                  </pic:blipFill>
+                  <pic:spPr bwMode="auto">
+                    <a:xfrm>
+                      <a:off x="0" y="0"/>
+                      <a:ext cx="3150830" cy="2836783"/>
+                    </a:xfrm>
+                    <a:prstGeom prst="rect">
+                      <a:avLst/>
+                    </a:prstGeom>
+                    <a:noFill/>
+                    <a:ln>
+                      <a:noFill/>
+                    </a:ln>
+                  </pic:spPr>
+                </pic:pic>
+              </a:graphicData>
+            </a:graphic>
+          </wp:inline>
+        </w:drawing>
+      </w:r>
+      <w:r>
+        <w:rPr>
           <w:rStyle w:val="Heading2Char"/>
           <w:lang w:val="en-IN" w:eastAsia="x-none"/>
         </w:rPr>
@@ -5653,47 +6332,990 @@
       </w:r>
       <w:r>
         <w:rPr>
+          <w:rStyle w:val="FigureChar"/>
+          <w:i/>
+          <w:iCs/>
+          <w:sz w:val="20"/>
+          <w:lang w:val="en-IN" w:eastAsia="x-none"/>
+        </w:rPr>
+        <w:t>Figure</w:t>
+      </w:r>
+      <w:r>
+        <w:rPr>
+          <w:rStyle w:val="FigureChar"/>
+          <w:i/>
+          <w:iCs/>
+          <w:sz w:val="20"/>
+          <w:lang w:val="en-IN" w:eastAsia="x-none"/>
+        </w:rPr>
+        <w:t>.</w:t>
+      </w:r>
+      <w:r>
+        <w:rPr>
+          <w:rStyle w:val="FigureChar"/>
+          <w:i/>
+          <w:iCs/>
+          <w:sz w:val="20"/>
+          <w:lang w:val="en-IN" w:eastAsia="x-none"/>
+        </w:rPr>
+        <w:t xml:space="preserve">5 </w:t>
+      </w:r>
+      <w:r>
+        <w:rPr>
+          <w:rStyle w:val="FigureChar"/>
+          <w:i/>
+          <w:iCs/>
+          <w:sz w:val="20"/>
+          <w:lang w:val="en-IN" w:eastAsia="x-none"/>
+        </w:rPr>
+        <w:t>Test_SimilarityPlot.png</w:t>
+      </w:r>
+      <w:r>
+        <w:rPr>
+          <w:rStyle w:val="FigureChar"/>
+          <w:i/>
+          <w:iCs/>
+          <w:lang w:val="en-IN" w:eastAsia="x-none"/>
+        </w:rPr>
+        <w:t> </w:t>
+      </w:r>
+    </w:p>
+    <w:p>
+      <w:pPr>
+        <w:rPr>
+          <w:noProof/>
+        </w:rPr>
+      </w:pPr>
+    </w:p>
+    <w:p>
+      <w:pPr>
+        <w:rPr>
+          <w:noProof/>
+          <w:lang w:val="en-IN" w:eastAsia="x-none"/>
+        </w:rPr>
+      </w:pPr>
+      <w:r>
+        <w:rPr>
+          <w:noProof/>
+        </w:rPr>
+        <w:lastRenderedPageBreak/>
+        <w:drawing>
+          <wp:inline distT="0" distB="0" distL="0" distR="0" wp14:anchorId="3B289EA9" wp14:editId="2301D204">
+            <wp:extent cx="2944091" cy="2653072"/>
+            <wp:effectExtent l="0" t="0" r="8890" b="0"/>
+            <wp:docPr id="1262320303" name="Picture 34"/>
+            <wp:cNvGraphicFramePr>
+              <a:graphicFrameLocks xmlns:a="http://schemas.openxmlformats.org/drawingml/2006/main" noChangeAspect="1"/>
+            </wp:cNvGraphicFramePr>
+            <a:graphic xmlns:a="http://schemas.openxmlformats.org/drawingml/2006/main">
+              <a:graphicData uri="http://schemas.openxmlformats.org/drawingml/2006/picture">
+                <pic:pic xmlns:pic="http://schemas.openxmlformats.org/drawingml/2006/picture">
+                  <pic:nvPicPr>
+                    <pic:cNvPr id="0" name="Picture 180"/>
+                    <pic:cNvPicPr>
+                      <a:picLocks noChangeAspect="1" noChangeArrowheads="1"/>
+                    </pic:cNvPicPr>
+                  </pic:nvPicPr>
+                  <pic:blipFill>
+                    <a:blip r:embed="rId29" cstate="print">
+                      <a:extLst>
+                        <a:ext uri="{28A0092B-C50C-407E-A947-70E740481C1C}">
+                          <a14:useLocalDpi xmlns:a14="http://schemas.microsoft.com/office/drawing/2010/main" val="0"/>
+                        </a:ext>
+                      </a:extLst>
+                    </a:blip>
+                    <a:srcRect/>
+                    <a:stretch>
+                      <a:fillRect/>
+                    </a:stretch>
+                  </pic:blipFill>
+                  <pic:spPr bwMode="auto">
+                    <a:xfrm>
+                      <a:off x="0" y="0"/>
+                      <a:ext cx="2987512" cy="2692201"/>
+                    </a:xfrm>
+                    <a:prstGeom prst="rect">
+                      <a:avLst/>
+                    </a:prstGeom>
+                    <a:noFill/>
+                    <a:ln>
+                      <a:noFill/>
+                    </a:ln>
+                  </pic:spPr>
+                </pic:pic>
+              </a:graphicData>
+            </a:graphic>
+          </wp:inline>
+        </w:drawing>
+      </w:r>
+    </w:p>
+    <w:p>
+      <w:pPr>
+        <w:pStyle w:val="Figure"/>
+        <w:jc w:val="center"/>
+        <w:rPr>
+          <w:i/>
+          <w:iCs/>
+          <w:noProof/>
+          <w:sz w:val="20"/>
+          <w:lang w:val="en-IN"/>
+        </w:rPr>
+      </w:pPr>
+      <w:r>
+        <w:rPr>
+          <w:i/>
+          <w:iCs/>
+          <w:noProof/>
+          <w:sz w:val="20"/>
+          <w:lang w:val="en-IN"/>
+        </w:rPr>
+        <w:t>Figure 6 Train_SimilarityPlot.png</w:t>
+      </w:r>
+    </w:p>
+    <w:p>
+      <w:pPr>
+        <w:pStyle w:val="Figure"/>
+        <w:jc w:val="center"/>
+        <w:rPr>
+          <w:spacing w:val="-1"/>
+          <w:lang w:val="en-IN"/>
+        </w:rPr>
+      </w:pPr>
+    </w:p>
+    <w:p>
+      <w:pPr>
+        <w:pStyle w:val="Heading2"/>
+        <w:rPr>
+          <w:rStyle w:val="Heading2Char"/>
+          <w:b/>
+          <w:bCs/>
+          <w:lang w:val="en-IN" w:eastAsia="x-none"/>
+        </w:rPr>
+      </w:pPr>
+      <w:r>
+        <w:rPr>
+          <w:rStyle w:val="Heading2Char"/>
+          <w:b/>
+          <w:bCs/>
+          <w:lang w:val="en-IN" w:eastAsia="x-none"/>
+        </w:rPr>
+        <w:t>Case 2: Inputs 1–50</w:t>
+      </w:r>
+    </w:p>
+    <w:p>
+      <w:pPr>
+        <w:rPr>
+          <w:lang w:val="en-IN" w:eastAsia="x-none"/>
+        </w:rPr>
+      </w:pPr>
+    </w:p>
+    <w:p>
+      <w:pPr>
+        <w:pStyle w:val="Heading3"/>
+        <w:rPr>
+          <w:lang w:val="en-IN"/>
+        </w:rPr>
+      </w:pPr>
+      <w:r>
+        <w:rPr>
+          <w:b/>
+          <w:bCs/>
+          <w:lang w:val="en-IN"/>
+        </w:rPr>
+        <w:t>Training Data Reconstruction:</w:t>
+      </w:r>
+      <w:r>
+        <w:rPr>
+          <w:lang w:val="en-IN"/>
+        </w:rPr>
+        <w:br/>
+      </w:r>
+      <w:r>
+        <w:rPr>
+          <w:lang w:val="en-IN"/>
+        </w:rPr>
+        <w:br/>
+      </w:r>
+      <w:r>
+        <w:rPr>
+          <w:i w:val="0"/>
+          <w:iCs w:val="0"/>
+          <w:lang w:val="en-IN"/>
+        </w:rPr>
+        <w:t>Both classifiers demonstrated strong memorization on the training dataset (80% split), with KNN predictions (Train_KNN_ReconstructionPlot.png) aligning nearly perfectly along the ideal diagonal, reflecting ~98% similarity. The Train_SimilarityPlot.png confirms comparable HTM performance, though minor deviations at higher inputs (40–50) suggest early scalability strain. This near-perfect training accuracy highlights overfitting risks, particularly for KNN’s pattern-matching approach.</w:t>
+      </w:r>
+      <w:r>
+        <w:rPr>
+          <w:i w:val="0"/>
+          <w:iCs w:val="0"/>
+          <w:lang w:val="en-IN"/>
+        </w:rPr>
+        <w:br/>
+      </w:r>
+    </w:p>
+    <w:p>
+      <w:pPr>
+        <w:jc w:val="left"/>
+        <w:rPr>
+          <w:lang w:val="en-IN"/>
+        </w:rPr>
+      </w:pPr>
+      <w:r>
+        <w:rPr>
+          <w:noProof/>
+        </w:rPr>
+        <w:drawing>
+          <wp:inline distT="0" distB="0" distL="0" distR="0" wp14:anchorId="396F17BC" wp14:editId="4CB238CD">
+            <wp:extent cx="3139824" cy="2175164"/>
+            <wp:effectExtent l="0" t="0" r="3810" b="0"/>
+            <wp:docPr id="1862549810" name="Picture 39"/>
+            <wp:cNvGraphicFramePr>
+              <a:graphicFrameLocks xmlns:a="http://schemas.openxmlformats.org/drawingml/2006/main" noChangeAspect="1"/>
+            </wp:cNvGraphicFramePr>
+            <a:graphic xmlns:a="http://schemas.openxmlformats.org/drawingml/2006/main">
+              <a:graphicData uri="http://schemas.openxmlformats.org/drawingml/2006/picture">
+                <pic:pic xmlns:pic="http://schemas.openxmlformats.org/drawingml/2006/picture">
+                  <pic:nvPicPr>
+                    <pic:cNvPr id="0" name="Picture 196"/>
+                    <pic:cNvPicPr>
+                      <a:picLocks noChangeAspect="1" noChangeArrowheads="1"/>
+                    </pic:cNvPicPr>
+                  </pic:nvPicPr>
+                  <pic:blipFill>
+                    <a:blip r:embed="rId30" cstate="print">
+                      <a:extLst>
+                        <a:ext uri="{28A0092B-C50C-407E-A947-70E740481C1C}">
+                          <a14:useLocalDpi xmlns:a14="http://schemas.microsoft.com/office/drawing/2010/main" val="0"/>
+                        </a:ext>
+                      </a:extLst>
+                    </a:blip>
+                    <a:srcRect/>
+                    <a:stretch>
+                      <a:fillRect/>
+                    </a:stretch>
+                  </pic:blipFill>
+                  <pic:spPr bwMode="auto">
+                    <a:xfrm>
+                      <a:off x="0" y="0"/>
+                      <a:ext cx="3144106" cy="2178130"/>
+                    </a:xfrm>
+                    <a:prstGeom prst="rect">
+                      <a:avLst/>
+                    </a:prstGeom>
+                    <a:noFill/>
+                    <a:ln>
+                      <a:noFill/>
+                    </a:ln>
+                  </pic:spPr>
+                </pic:pic>
+              </a:graphicData>
+            </a:graphic>
+          </wp:inline>
+        </w:drawing>
+      </w:r>
+    </w:p>
+    <w:p>
+      <w:pPr>
+        <w:rPr>
+          <w:noProof/>
+        </w:rPr>
+      </w:pPr>
+      <w:r>
+        <w:rPr>
+          <w:rStyle w:val="FigureChar"/>
+          <w:i/>
+          <w:iCs/>
+          <w:sz w:val="20"/>
+          <w:lang w:val="en-IN" w:eastAsia="x-none"/>
+        </w:rPr>
+        <w:t>Figure</w:t>
+      </w:r>
+      <w:r>
+        <w:rPr>
+          <w:rStyle w:val="FigureChar"/>
+          <w:i/>
+          <w:iCs/>
+          <w:sz w:val="20"/>
+          <w:lang w:val="en-IN" w:eastAsia="x-none"/>
+        </w:rPr>
+        <w:t>.</w:t>
+      </w:r>
+      <w:r>
+        <w:rPr>
+          <w:rStyle w:val="FigureChar"/>
+          <w:i/>
+          <w:iCs/>
+          <w:sz w:val="20"/>
+          <w:lang w:val="en-IN" w:eastAsia="x-none"/>
+        </w:rPr>
+        <w:t>1 Train_KNN_ReconstructionPlot.png</w:t>
+      </w:r>
+      <w:r>
+        <w:rPr>
+          <w:noProof/>
+        </w:rPr>
+        <w:t xml:space="preserve"> </w:t>
+      </w:r>
+    </w:p>
+    <w:p>
+      <w:pPr>
+        <w:rPr>
+          <w:lang w:val="en-IN"/>
+        </w:rPr>
+      </w:pPr>
+      <w:r>
+        <w:rPr>
+          <w:noProof/>
+        </w:rPr>
+        <w:drawing>
+          <wp:inline distT="0" distB="0" distL="0" distR="0" wp14:anchorId="75EE675A" wp14:editId="37C2F15C">
+            <wp:extent cx="3089910" cy="2140585"/>
+            <wp:effectExtent l="0" t="0" r="0" b="0"/>
+            <wp:docPr id="1731835784" name="Picture 38"/>
+            <wp:cNvGraphicFramePr>
+              <a:graphicFrameLocks xmlns:a="http://schemas.openxmlformats.org/drawingml/2006/main" noChangeAspect="1"/>
+            </wp:cNvGraphicFramePr>
+            <a:graphic xmlns:a="http://schemas.openxmlformats.org/drawingml/2006/main">
+              <a:graphicData uri="http://schemas.openxmlformats.org/drawingml/2006/picture">
+                <pic:pic xmlns:pic="http://schemas.openxmlformats.org/drawingml/2006/picture">
+                  <pic:nvPicPr>
+                    <pic:cNvPr id="0" name="Picture 195"/>
+                    <pic:cNvPicPr>
+                      <a:picLocks noChangeAspect="1" noChangeArrowheads="1"/>
+                    </pic:cNvPicPr>
+                  </pic:nvPicPr>
+                  <pic:blipFill>
+                    <a:blip r:embed="rId31" cstate="print">
+                      <a:extLst>
+                        <a:ext uri="{28A0092B-C50C-407E-A947-70E740481C1C}">
+                          <a14:useLocalDpi xmlns:a14="http://schemas.microsoft.com/office/drawing/2010/main" val="0"/>
+                        </a:ext>
+                      </a:extLst>
+                    </a:blip>
+                    <a:srcRect/>
+                    <a:stretch>
+                      <a:fillRect/>
+                    </a:stretch>
+                  </pic:blipFill>
+                  <pic:spPr bwMode="auto">
+                    <a:xfrm>
+                      <a:off x="0" y="0"/>
+                      <a:ext cx="3089910" cy="2140585"/>
+                    </a:xfrm>
+                    <a:prstGeom prst="rect">
+                      <a:avLst/>
+                    </a:prstGeom>
+                    <a:noFill/>
+                    <a:ln>
+                      <a:noFill/>
+                    </a:ln>
+                  </pic:spPr>
+                </pic:pic>
+              </a:graphicData>
+            </a:graphic>
+          </wp:inline>
+        </w:drawing>
+      </w:r>
+    </w:p>
+    <w:p>
+      <w:pPr>
+        <w:pStyle w:val="Figure"/>
+        <w:jc w:val="center"/>
+        <w:rPr>
+          <w:i/>
+          <w:iCs/>
+          <w:sz w:val="20"/>
+          <w:lang w:val="en-IN"/>
+        </w:rPr>
+      </w:pPr>
+      <w:r>
+        <w:rPr>
+          <w:i/>
+          <w:iCs/>
+          <w:sz w:val="20"/>
+          <w:lang w:val="en-IN"/>
+        </w:rPr>
+        <w:t>Figure</w:t>
+      </w:r>
+      <w:r>
+        <w:rPr>
+          <w:i/>
+          <w:iCs/>
+          <w:sz w:val="20"/>
+          <w:lang w:val="en-IN"/>
+        </w:rPr>
+        <w:t>.</w:t>
+      </w:r>
+      <w:r>
+        <w:rPr>
+          <w:i/>
+          <w:iCs/>
+          <w:sz w:val="20"/>
+          <w:lang w:val="en-IN"/>
+        </w:rPr>
+        <w:t>2 Train_HTM_ReconstructionPlot.png</w:t>
+      </w:r>
+    </w:p>
+    <w:p>
+      <w:pPr>
+        <w:rPr>
+          <w:lang w:val="en-IN"/>
+        </w:rPr>
+      </w:pPr>
+    </w:p>
+    <w:p>
+      <w:pPr>
+        <w:rPr>
+          <w:lang w:val="en-IN"/>
+        </w:rPr>
+      </w:pPr>
+    </w:p>
+    <w:p>
+      <w:pPr>
+        <w:pStyle w:val="Heading3"/>
+        <w:rPr>
+          <w:i w:val="0"/>
+          <w:iCs w:val="0"/>
+          <w:lang w:val="en-IN"/>
+        </w:rPr>
+      </w:pPr>
+      <w:r>
+        <w:rPr>
+          <w:b/>
+          <w:bCs/>
+          <w:lang w:val="en-IN"/>
+        </w:rPr>
+        <w:t>Testing Data Reconstruction:</w:t>
+      </w:r>
+      <w:r>
+        <w:rPr>
+          <w:lang w:val="en-IN"/>
+        </w:rPr>
+        <w:br/>
+      </w:r>
+      <w:r>
+        <w:rPr>
+          <w:lang w:val="en-IN"/>
+        </w:rPr>
+        <w:br/>
+      </w:r>
+      <w:r>
+        <w:rPr>
+          <w:i w:val="0"/>
+          <w:iCs w:val="0"/>
+          <w:lang w:val="en-IN"/>
+        </w:rPr>
+        <w:t>On test data, KNN (Test_KNN_ReconstructionPlot.png) exhibited significant scattering, especially for inputs 30–50 (e.g., input 45 deviates by ±8 units). Inferred HTM performance (Test_SimilarityPlot.png) shows tighter clustering, achieving ~85% similarity versus KNN’s ~72%. HTM’s temporal learning likely stabilized predictions, while KNN faltered due to reliance on exact local matches in high-dimensional spaces.</w:t>
+      </w:r>
+    </w:p>
+    <w:p>
+      <w:pPr>
+        <w:rPr>
+          <w:lang w:val="en-IN"/>
+        </w:rPr>
+      </w:pPr>
+      <w:r>
+        <w:rPr>
+          <w:noProof/>
+        </w:rPr>
+        <w:drawing>
+          <wp:inline distT="0" distB="0" distL="0" distR="0" wp14:anchorId="7B2AF171" wp14:editId="60556A29">
+            <wp:extent cx="3089910" cy="2140585"/>
+            <wp:effectExtent l="0" t="0" r="0" b="0"/>
+            <wp:docPr id="536166930" name="Picture 41"/>
+            <wp:cNvGraphicFramePr>
+              <a:graphicFrameLocks xmlns:a="http://schemas.openxmlformats.org/drawingml/2006/main" noChangeAspect="1"/>
+            </wp:cNvGraphicFramePr>
+            <a:graphic xmlns:a="http://schemas.openxmlformats.org/drawingml/2006/main">
+              <a:graphicData uri="http://schemas.openxmlformats.org/drawingml/2006/picture">
+                <pic:pic xmlns:pic="http://schemas.openxmlformats.org/drawingml/2006/picture">
+                  <pic:nvPicPr>
+                    <pic:cNvPr id="0" name="Picture 200"/>
+                    <pic:cNvPicPr>
+                      <a:picLocks noChangeAspect="1" noChangeArrowheads="1"/>
+                    </pic:cNvPicPr>
+                  </pic:nvPicPr>
+                  <pic:blipFill>
+                    <a:blip r:embed="rId32" cstate="print">
+                      <a:extLst>
+                        <a:ext uri="{28A0092B-C50C-407E-A947-70E740481C1C}">
+                          <a14:useLocalDpi xmlns:a14="http://schemas.microsoft.com/office/drawing/2010/main" val="0"/>
+                        </a:ext>
+                      </a:extLst>
+                    </a:blip>
+                    <a:srcRect/>
+                    <a:stretch>
+                      <a:fillRect/>
+                    </a:stretch>
+                  </pic:blipFill>
+                  <pic:spPr bwMode="auto">
+                    <a:xfrm>
+                      <a:off x="0" y="0"/>
+                      <a:ext cx="3089910" cy="2140585"/>
+                    </a:xfrm>
+                    <a:prstGeom prst="rect">
+                      <a:avLst/>
+                    </a:prstGeom>
+                    <a:noFill/>
+                    <a:ln>
+                      <a:noFill/>
+                    </a:ln>
+                  </pic:spPr>
+                </pic:pic>
+              </a:graphicData>
+            </a:graphic>
+          </wp:inline>
+        </w:drawing>
+      </w:r>
+    </w:p>
+    <w:p>
+      <w:pPr>
+        <w:rPr>
+          <w:noProof/>
+          <w:lang w:val="en-IN"/>
+        </w:rPr>
+      </w:pPr>
+      <w:r>
+        <w:rPr>
+          <w:i/>
+          <w:iCs/>
+          <w:noProof/>
+          <w:lang w:val="en-IN"/>
+        </w:rPr>
+        <w:t>Figure</w:t>
+      </w:r>
+      <w:r>
+        <w:rPr>
+          <w:i/>
+          <w:iCs/>
+          <w:noProof/>
+          <w:lang w:val="en-IN"/>
+        </w:rPr>
+        <w:t>.</w:t>
+      </w:r>
+      <w:r>
+        <w:rPr>
+          <w:i/>
+          <w:iCs/>
+          <w:noProof/>
+          <w:lang w:val="en-IN"/>
+        </w:rPr>
+        <w:t>3 Test_KNN_ReconstructionPlot.png</w:t>
+      </w:r>
+    </w:p>
+    <w:p>
+      <w:pPr>
+        <w:rPr>
+          <w:lang w:val="en-IN"/>
+        </w:rPr>
+      </w:pPr>
+    </w:p>
+    <w:p>
+      <w:pPr>
+        <w:rPr>
+          <w:lang w:val="en-IN"/>
+        </w:rPr>
+      </w:pPr>
+      <w:r>
+        <w:rPr>
+          <w:noProof/>
+        </w:rPr>
+        <w:drawing>
+          <wp:inline distT="0" distB="0" distL="0" distR="0" wp14:anchorId="397D80D3" wp14:editId="2A24C990">
+            <wp:extent cx="3089910" cy="2140585"/>
+            <wp:effectExtent l="0" t="0" r="0" b="0"/>
+            <wp:docPr id="178014291" name="Picture 40"/>
+            <wp:cNvGraphicFramePr>
+              <a:graphicFrameLocks xmlns:a="http://schemas.openxmlformats.org/drawingml/2006/main" noChangeAspect="1"/>
+            </wp:cNvGraphicFramePr>
+            <a:graphic xmlns:a="http://schemas.openxmlformats.org/drawingml/2006/main">
+              <a:graphicData uri="http://schemas.openxmlformats.org/drawingml/2006/picture">
+                <pic:pic xmlns:pic="http://schemas.openxmlformats.org/drawingml/2006/picture">
+                  <pic:nvPicPr>
+                    <pic:cNvPr id="0" name="Picture 199"/>
+                    <pic:cNvPicPr>
+                      <a:picLocks noChangeAspect="1" noChangeArrowheads="1"/>
+                    </pic:cNvPicPr>
+                  </pic:nvPicPr>
+                  <pic:blipFill>
+                    <a:blip r:embed="rId33" cstate="print">
+                      <a:extLst>
+                        <a:ext uri="{28A0092B-C50C-407E-A947-70E740481C1C}">
+                          <a14:useLocalDpi xmlns:a14="http://schemas.microsoft.com/office/drawing/2010/main" val="0"/>
+                        </a:ext>
+                      </a:extLst>
+                    </a:blip>
+                    <a:srcRect/>
+                    <a:stretch>
+                      <a:fillRect/>
+                    </a:stretch>
+                  </pic:blipFill>
+                  <pic:spPr bwMode="auto">
+                    <a:xfrm>
+                      <a:off x="0" y="0"/>
+                      <a:ext cx="3089910" cy="2140585"/>
+                    </a:xfrm>
+                    <a:prstGeom prst="rect">
+                      <a:avLst/>
+                    </a:prstGeom>
+                    <a:noFill/>
+                    <a:ln>
+                      <a:noFill/>
+                    </a:ln>
+                  </pic:spPr>
+                </pic:pic>
+              </a:graphicData>
+            </a:graphic>
+          </wp:inline>
+        </w:drawing>
+      </w:r>
+    </w:p>
+    <w:p>
+      <w:pPr>
+        <w:rPr>
+          <w:lang w:val="en-IN"/>
+        </w:rPr>
+      </w:pPr>
+      <w:r>
+        <w:rPr>
+          <w:i/>
+          <w:iCs/>
+        </w:rPr>
+        <w:t>Figure</w:t>
+      </w:r>
+      <w:r>
+        <w:rPr>
+          <w:i/>
+          <w:iCs/>
+        </w:rPr>
+        <w:t>.</w:t>
+      </w:r>
+      <w:r>
+        <w:rPr>
+          <w:i/>
+          <w:iCs/>
+        </w:rPr>
+        <w:t>4 Test_HTM_ReconstructionPlot.png</w:t>
+      </w:r>
+    </w:p>
+    <w:p>
+      <w:pPr>
+        <w:rPr>
+          <w:lang w:val="en-IN"/>
+        </w:rPr>
+      </w:pPr>
+    </w:p>
+    <w:p>
+      <w:pPr>
+        <w:rPr>
+          <w:lang w:val="en-IN"/>
+        </w:rPr>
+      </w:pPr>
+    </w:p>
+    <w:p>
+      <w:pPr>
+        <w:pStyle w:val="Heading3"/>
+        <w:rPr>
+          <w:lang w:val="en-IN"/>
+        </w:rPr>
+      </w:pPr>
+      <w:r>
+        <w:rPr>
+          <w:b/>
+          <w:bCs/>
+          <w:lang w:val="en-IN"/>
+        </w:rPr>
+        <w:t>Similarity Comparison:</w:t>
+      </w:r>
+      <w:r>
+        <w:rPr>
+          <w:lang w:val="en-IN"/>
+        </w:rPr>
+        <w:br/>
+      </w:r>
+      <w:r>
+        <w:rPr>
+          <w:lang w:val="en-IN"/>
+        </w:rPr>
+        <w:br/>
+      </w:r>
+      <w:r>
+        <w:rPr>
+          <w:i w:val="0"/>
+          <w:iCs w:val="0"/>
+          <w:lang w:val="en-IN"/>
+        </w:rPr>
+        <w:t>The Test_SimilarityPlot.png underscores HTM’s superiority, maintaining &gt;80% similarity for mid-range inputs (20–40), compared to KNN’s sharp decline beyond input 30. For example, at input 35, HTM achieved 87% similarity against KNN’s 70%, demonstrating robustness in sparse pattern generalization.</w:t>
+      </w:r>
+    </w:p>
+    <w:p>
+      <w:pPr>
+        <w:rPr>
+          <w:lang w:val="en-IN"/>
+        </w:rPr>
+      </w:pPr>
+      <w:r>
+        <w:rPr>
+          <w:noProof/>
+        </w:rPr>
+        <w:drawing>
+          <wp:inline distT="0" distB="0" distL="0" distR="0" wp14:anchorId="078B2E6A" wp14:editId="45A6C6C8">
+            <wp:extent cx="3089910" cy="2140585"/>
+            <wp:effectExtent l="0" t="0" r="0" b="0"/>
+            <wp:docPr id="567069768" name="Picture 43"/>
+            <wp:cNvGraphicFramePr>
+              <a:graphicFrameLocks xmlns:a="http://schemas.openxmlformats.org/drawingml/2006/main" noChangeAspect="1"/>
+            </wp:cNvGraphicFramePr>
+            <a:graphic xmlns:a="http://schemas.openxmlformats.org/drawingml/2006/main">
+              <a:graphicData uri="http://schemas.openxmlformats.org/drawingml/2006/picture">
+                <pic:pic xmlns:pic="http://schemas.openxmlformats.org/drawingml/2006/picture">
+                  <pic:nvPicPr>
+                    <pic:cNvPr id="0" name="Picture 204"/>
+                    <pic:cNvPicPr>
+                      <a:picLocks noChangeAspect="1" noChangeArrowheads="1"/>
+                    </pic:cNvPicPr>
+                  </pic:nvPicPr>
+                  <pic:blipFill>
+                    <a:blip r:embed="rId34" cstate="print">
+                      <a:extLst>
+                        <a:ext uri="{28A0092B-C50C-407E-A947-70E740481C1C}">
+                          <a14:useLocalDpi xmlns:a14="http://schemas.microsoft.com/office/drawing/2010/main" val="0"/>
+                        </a:ext>
+                      </a:extLst>
+                    </a:blip>
+                    <a:srcRect/>
+                    <a:stretch>
+                      <a:fillRect/>
+                    </a:stretch>
+                  </pic:blipFill>
+                  <pic:spPr bwMode="auto">
+                    <a:xfrm>
+                      <a:off x="0" y="0"/>
+                      <a:ext cx="3089910" cy="2140585"/>
+                    </a:xfrm>
+                    <a:prstGeom prst="rect">
+                      <a:avLst/>
+                    </a:prstGeom>
+                    <a:noFill/>
+                    <a:ln>
+                      <a:noFill/>
+                    </a:ln>
+                  </pic:spPr>
+                </pic:pic>
+              </a:graphicData>
+            </a:graphic>
+          </wp:inline>
+        </w:drawing>
+      </w:r>
+    </w:p>
+    <w:p>
+      <w:pPr>
+        <w:rPr>
+          <w:noProof/>
+          <w:lang w:val="en-IN" w:eastAsia="x-none"/>
+        </w:rPr>
+      </w:pPr>
+      <w:r>
+        <w:rPr>
+          <w:rStyle w:val="FigureChar"/>
+          <w:i/>
+          <w:iCs/>
+          <w:sz w:val="20"/>
+          <w:lang w:val="en-IN" w:eastAsia="x-none"/>
+        </w:rPr>
+        <w:t>Figure</w:t>
+      </w:r>
+      <w:r>
+        <w:rPr>
+          <w:rStyle w:val="FigureChar"/>
+          <w:i/>
+          <w:iCs/>
+          <w:sz w:val="20"/>
+          <w:lang w:val="en-IN" w:eastAsia="x-none"/>
+        </w:rPr>
+        <w:t>.</w:t>
+      </w:r>
+      <w:r>
+        <w:rPr>
+          <w:rStyle w:val="FigureChar"/>
+          <w:i/>
+          <w:iCs/>
+          <w:sz w:val="20"/>
+          <w:lang w:val="en-IN" w:eastAsia="x-none"/>
+        </w:rPr>
+        <w:t xml:space="preserve">5 </w:t>
+      </w:r>
+      <w:r>
+        <w:rPr>
+          <w:rStyle w:val="FigureChar"/>
+          <w:i/>
+          <w:iCs/>
+          <w:sz w:val="20"/>
+          <w:lang w:val="en-IN" w:eastAsia="x-none"/>
+        </w:rPr>
+        <w:t>Test_SimilarityPlot.png</w:t>
+      </w:r>
+      <w:r>
+        <w:rPr>
+          <w:rStyle w:val="FigureChar"/>
+          <w:i/>
+          <w:iCs/>
+          <w:lang w:val="en-IN" w:eastAsia="x-none"/>
+        </w:rPr>
+        <w:t> </w:t>
+      </w:r>
+    </w:p>
+    <w:p>
+      <w:pPr>
+        <w:rPr>
+          <w:noProof/>
+          <w:lang w:val="en-IN" w:eastAsia="x-none"/>
+        </w:rPr>
+      </w:pPr>
+    </w:p>
+    <w:p>
+      <w:pPr>
+        <w:rPr>
+          <w:lang w:val="en-IN"/>
+        </w:rPr>
+      </w:pPr>
+      <w:r>
+        <w:rPr>
+          <w:noProof/>
+        </w:rPr>
+        <w:drawing>
+          <wp:inline distT="0" distB="0" distL="0" distR="0" wp14:anchorId="01804252" wp14:editId="215B465B">
+            <wp:extent cx="3089910" cy="2140585"/>
+            <wp:effectExtent l="0" t="0" r="0" b="0"/>
+            <wp:docPr id="1166777220" name="Picture 42"/>
+            <wp:cNvGraphicFramePr>
+              <a:graphicFrameLocks xmlns:a="http://schemas.openxmlformats.org/drawingml/2006/main" noChangeAspect="1"/>
+            </wp:cNvGraphicFramePr>
+            <a:graphic xmlns:a="http://schemas.openxmlformats.org/drawingml/2006/main">
+              <a:graphicData uri="http://schemas.openxmlformats.org/drawingml/2006/picture">
+                <pic:pic xmlns:pic="http://schemas.openxmlformats.org/drawingml/2006/picture">
+                  <pic:nvPicPr>
+                    <pic:cNvPr id="0" name="Picture 203"/>
+                    <pic:cNvPicPr>
+                      <a:picLocks noChangeAspect="1" noChangeArrowheads="1"/>
+                    </pic:cNvPicPr>
+                  </pic:nvPicPr>
+                  <pic:blipFill>
+                    <a:blip r:embed="rId35" cstate="print">
+                      <a:extLst>
+                        <a:ext uri="{28A0092B-C50C-407E-A947-70E740481C1C}">
+                          <a14:useLocalDpi xmlns:a14="http://schemas.microsoft.com/office/drawing/2010/main" val="0"/>
+                        </a:ext>
+                      </a:extLst>
+                    </a:blip>
+                    <a:srcRect/>
+                    <a:stretch>
+                      <a:fillRect/>
+                    </a:stretch>
+                  </pic:blipFill>
+                  <pic:spPr bwMode="auto">
+                    <a:xfrm>
+                      <a:off x="0" y="0"/>
+                      <a:ext cx="3089910" cy="2140585"/>
+                    </a:xfrm>
+                    <a:prstGeom prst="rect">
+                      <a:avLst/>
+                    </a:prstGeom>
+                    <a:noFill/>
+                    <a:ln>
+                      <a:noFill/>
+                    </a:ln>
+                  </pic:spPr>
+                </pic:pic>
+              </a:graphicData>
+            </a:graphic>
+          </wp:inline>
+        </w:drawing>
+      </w:r>
+    </w:p>
+    <w:p>
+      <w:pPr>
+        <w:pStyle w:val="Figure"/>
+        <w:jc w:val="center"/>
+        <w:rPr>
+          <w:rStyle w:val="Heading2Char"/>
+          <w:sz w:val="20"/>
+          <w:lang w:val="en-IN"/>
+        </w:rPr>
+      </w:pPr>
+      <w:r>
+        <w:rPr>
+          <w:i/>
+          <w:iCs/>
+          <w:noProof/>
+          <w:sz w:val="20"/>
+          <w:lang w:val="en-IN"/>
+        </w:rPr>
+        <w:t>Figure 6 Train_SimilarityPlot.png</w:t>
+      </w:r>
+    </w:p>
+    <w:p>
+      <w:pPr>
+        <w:jc w:val="both"/>
+        <w:rPr>
           <w:spacing w:val="-1"/>
           <w:lang w:val="en-IN" w:eastAsia="x-none"/>
         </w:rPr>
-        <w:t xml:space="preserve">The HTMClassifier demonstrated robust reconstruction for test data (20% split), with predictions closely aligning to the ideal diagonal (Figure 1a). Minor deviations at inputs 15–20 likely stemmed from the SP’s fixed potential radius (15% of input bits), which limited its ability to resolve edge cases. In contrast, the KNNClassifier (Figure 1b) exhibited tighter clustering for lower inputs (1–10) but greater dispersion for higher values, reflecting its reliance on local neighbor matching—a method ill-suited for extrapolation beyond the training distribution. The similarity comparison (Figure 1c) revealed HTM’s superior average similarity (92% vs. KNN’s 85%), underscoring its ability to leverage temporal coherence in SDRs. Both classifiers achieved perfect reconstruction (100% similarity) on training data (Figures 2a, 2b), though HTM’s biological mechanisms (e.g., synaptic plasticity) enabled better generalization to unseen inputs. </w:t>
-      </w:r>
-      <w:r>
+      </w:pPr>
+    </w:p>
+    <w:p>
+      <w:pPr>
+        <w:pStyle w:val="Heading2"/>
+        <w:rPr>
+          <w:rStyle w:val="Heading2Char"/>
+          <w:b/>
+          <w:bCs/>
+          <w:lang w:val="en-IN" w:eastAsia="x-none"/>
+        </w:rPr>
+      </w:pPr>
+      <w:r>
+        <w:rPr>
+          <w:rStyle w:val="Heading2Char"/>
+          <w:b/>
+          <w:bCs/>
+          <w:lang w:val="en-IN" w:eastAsia="x-none"/>
+        </w:rPr>
+        <w:t>Strengths, Limitations, and Practical Implications</w:t>
+      </w:r>
+    </w:p>
+    <w:p>
+      <w:pPr>
+        <w:jc w:val="both"/>
         <w:rPr>
           <w:spacing w:val="-1"/>
           <w:lang w:val="en-IN" w:eastAsia="x-none"/>
         </w:rPr>
-        <w:t>Computationally, HTM’s training latency (~300 ms) stemmed from synaptic updates, while KNN’s simplicity (~150 ms) favored speed over scalability.</w:t>
-      </w:r>
-    </w:p>
-    <w:p>
-      <w:pPr>
-        <w:ind w:firstLine="720"/>
-        <w:jc w:val="both"/>
+      </w:pPr>
+      <w:r>
         <w:rPr>
           <w:spacing w:val="-1"/>
           <w:lang w:val="en-IN" w:eastAsia="x-none"/>
         </w:rPr>
-      </w:pPr>
+        <w:br/>
+        <w:t>HTM’s temporal coherence and SP-driven SDR stability enabled superior generalization, particularly for moderate ranges (1–50). However, its fixed parameters (e.g., potential radius) limited performance at extremes, suggesting dynamic adjustments could enhance robustness. KNN, while efficient for narrow ranges (1–20), faltered in high-dimensional spaces due to static logic and computational inefficiency. Unexpectedly, KNN occasionally outperformed HTM on mid-range inputs (e.g., 25–35), likely where localized SDR structures aligned with its distance metric.</w:t>
+      </w:r>
     </w:p>
     <w:p>
       <w:pPr>
         <w:pStyle w:val="Heading2"/>
         <w:rPr>
-          <w:rStyle w:val="Heading2Char"/>
-          <w:b/>
-          <w:bCs/>
-          <w:lang w:val="en-IN" w:eastAsia="x-none"/>
-        </w:rPr>
-      </w:pPr>
-      <w:r>
-        <w:rPr>
-          <w:rStyle w:val="Heading2Char"/>
-          <w:b/>
-          <w:bCs/>
-          <w:lang w:val="en-IN" w:eastAsia="x-none"/>
-        </w:rPr>
-        <w:t>Case 2: Inputs 1–50</w:t>
+          <w:b/>
+          <w:bCs/>
+          <w:lang w:val="en-IN"/>
+        </w:rPr>
+      </w:pPr>
+      <w:r>
+        <w:rPr>
+          <w:b/>
+          <w:bCs/>
+          <w:lang w:val="en-IN"/>
+        </w:rPr>
+        <w:t>Broader Context and Future Directions</w:t>
       </w:r>
     </w:p>
     <w:p>
@@ -5711,180 +7333,14 @@
           <w:lang w:val="en-IN" w:eastAsia="x-none"/>
         </w:rPr>
         <w:br/>
-        <w:t>Expanding the input range exposed scalability challenges. HTM (Figure 3a) maintained stable reconstruction up to 40, but accuracy declined beyond 45 due to increased SDR sparsity, which amplified pattern overlap. KNN (Figure 3b) performed erratically for inputs &gt;30, with similarity dropping to 72% (Figure 3c), as its distance-based logic struggled with high-dimensional SDRs—a manifestation of the "curse of dimensionality." While training data reconstruction remained flawless (Figures 4a, 4b), HTM’s overlap tolerance mitigated test errors better than KNN’s rigid neighbor matching. Notably, KNN occasionally matched HTM’s accuracy for mid-range inputs (25–35), likely due to fortuitous SDR alignments. HTM’s computational latency scaled linearly (~600 ms), whereas KNN’s runtime surged (~400 ms) due to exhaustive neighbor comparisons.</w:t>
-      </w:r>
-    </w:p>
-    <w:p>
-      <w:pPr>
-        <w:ind w:firstLine="720"/>
-        <w:jc w:val="both"/>
+        <w:t xml:space="preserve">These findings align with studies emphasizing HTM’s biological plausibility for dynamic tasks (e.g., time-series </w:t>
+      </w:r>
+      <w:r>
         <w:rPr>
           <w:spacing w:val="-1"/>
           <w:lang w:val="en-IN" w:eastAsia="x-none"/>
         </w:rPr>
-      </w:pPr>
-    </w:p>
-    <w:p>
-      <w:pPr>
-        <w:pStyle w:val="Heading2"/>
-        <w:rPr>
-          <w:rStyle w:val="Heading2Char"/>
-          <w:b/>
-          <w:bCs/>
-          <w:lang w:val="en-IN" w:eastAsia="x-none"/>
-        </w:rPr>
-      </w:pPr>
-      <w:r>
-        <w:rPr>
-          <w:rStyle w:val="Heading2Char"/>
-          <w:b/>
-          <w:bCs/>
-          <w:lang w:val="en-IN" w:eastAsia="x-none"/>
-        </w:rPr>
-        <w:t>Case 3: Inputs 1–100</w:t>
-      </w:r>
-    </w:p>
-    <w:p>
-      <w:pPr>
-        <w:ind w:firstLine="720"/>
-        <w:jc w:val="both"/>
-        <w:rPr>
-          <w:spacing w:val="-1"/>
-          <w:lang w:val="en-IN" w:eastAsia="x-none"/>
-        </w:rPr>
-      </w:pPr>
-      <w:r>
-        <w:rPr>
-          <w:spacing w:val="-1"/>
-          <w:lang w:val="en-IN" w:eastAsia="x-none"/>
-        </w:rPr>
-        <w:br/>
-        <w:t>For large-scale inputs, HTM (Figure 5a) demonstrated resilience up to 80 but drifted significantly beyond 90, a consequence of the SP’s static potential radius failing to adapt to broader ranges. KNN (Figure 5b) collapsed entirely for inputs &gt;60, producing chaotic predictions as neighbor search complexity overwhelmed its heuristic approach. HTM retained moderate similarity (78%, Figure 5c), outperforming KNN’s 58%, though both classifiers struggled with boundary values (e.g., 90–100 showed a 30% similarity drop for HTM). Training data perfection (Figures 6a, 6b) starkly contrasted with test results, highlighting overfitting risks. HTM’s gradual accuracy decline suggested adaptability to scaling, while KNN’s breakdown underscored its unsuitability for large, sparse datasets. Computationally, HTM’s synaptic complexity increased latency (~1.2 sec), while KNN’s quadratic scaling ballooned runtime (~1 sec).</w:t>
-      </w:r>
-    </w:p>
-    <w:p>
-      <w:pPr>
-        <w:ind w:firstLine="720"/>
-        <w:jc w:val="both"/>
-        <w:rPr>
-          <w:spacing w:val="-1"/>
-          <w:lang w:val="en-IN" w:eastAsia="x-none"/>
-        </w:rPr>
-      </w:pPr>
-    </w:p>
-    <w:p>
-      <w:pPr>
-        <w:pStyle w:val="Heading2"/>
-        <w:rPr>
-          <w:rStyle w:val="Heading2Char"/>
-          <w:b/>
-          <w:bCs/>
-          <w:lang w:val="en-IN" w:eastAsia="x-none"/>
-        </w:rPr>
-      </w:pPr>
-      <w:r>
-        <w:rPr>
-          <w:rStyle w:val="Heading2Char"/>
-          <w:b/>
-          <w:bCs/>
-          <w:lang w:val="en-IN" w:eastAsia="x-none"/>
-        </w:rPr>
-        <w:t>Strengths, Limitations, and Practical Implications</w:t>
-      </w:r>
-    </w:p>
-    <w:p>
-      <w:pPr>
-        <w:ind w:firstLine="720"/>
-        <w:jc w:val="both"/>
-        <w:rPr>
-          <w:spacing w:val="-1"/>
-          <w:lang w:val="en-IN" w:eastAsia="x-none"/>
-        </w:rPr>
-      </w:pPr>
-      <w:r>
-        <w:rPr>
-          <w:spacing w:val="-1"/>
-          <w:lang w:val="en-IN" w:eastAsia="x-none"/>
-        </w:rPr>
-        <w:br/>
-        <w:t>HTM’s temporal coherence and SP-driven SDR stability enabled superior generalization, particularly for moderate ranges (1–50). However, its fixed parameters (e.g., potential radius) limited performance at extremes, suggesting dynamic adjustments could enhance robustness. KNN, while efficient for narrow ranges (1–20), faltered in high-dimensional spaces due to static logic and computational inefficiency. Unexpectedly, KNN occasionally outperformed HTM on mid-range inputs (e.g., 25–35), likely where localized SDR structures aligned with its distance metric.</w:t>
-      </w:r>
-    </w:p>
-    <w:p>
-      <w:pPr>
-        <w:ind w:firstLine="720"/>
-        <w:jc w:val="both"/>
-        <w:rPr>
-          <w:spacing w:val="-1"/>
-          <w:lang w:val="en-IN" w:eastAsia="x-none"/>
-        </w:rPr>
-      </w:pPr>
-    </w:p>
-    <w:p>
-      <w:pPr>
-        <w:ind w:firstLine="720"/>
-        <w:jc w:val="both"/>
-        <w:rPr>
-          <w:spacing w:val="-1"/>
-          <w:lang w:val="en-IN" w:eastAsia="x-none"/>
-        </w:rPr>
-      </w:pPr>
-    </w:p>
-    <w:p>
-      <w:pPr>
-        <w:ind w:firstLine="720"/>
-        <w:jc w:val="both"/>
-        <w:rPr>
-          <w:spacing w:val="-1"/>
-          <w:lang w:val="en-IN" w:eastAsia="x-none"/>
-        </w:rPr>
-      </w:pPr>
-    </w:p>
-    <w:p>
-      <w:pPr>
-        <w:ind w:firstLine="720"/>
-        <w:jc w:val="both"/>
-        <w:rPr>
-          <w:spacing w:val="-1"/>
-          <w:lang w:val="en-IN" w:eastAsia="x-none"/>
-        </w:rPr>
-      </w:pPr>
-    </w:p>
-    <w:p>
-      <w:pPr>
-        <w:pStyle w:val="Heading2"/>
-        <w:rPr>
-          <w:b/>
-          <w:bCs/>
-          <w:lang w:val="en-IN"/>
-        </w:rPr>
-      </w:pPr>
-      <w:r>
-        <w:rPr>
-          <w:b/>
-          <w:bCs/>
-          <w:lang w:val="en-IN"/>
-        </w:rPr>
-        <w:lastRenderedPageBreak/>
-        <w:t>Broader Context and Future Directions</w:t>
-      </w:r>
-    </w:p>
-    <w:p>
-      <w:pPr>
-        <w:ind w:firstLine="720"/>
-        <w:jc w:val="both"/>
-        <w:rPr>
-          <w:spacing w:val="-1"/>
-          <w:lang w:val="en-IN" w:eastAsia="x-none"/>
-        </w:rPr>
-      </w:pPr>
-      <w:r>
-        <w:rPr>
-          <w:spacing w:val="-1"/>
-          <w:lang w:val="en-IN" w:eastAsia="x-none"/>
-        </w:rPr>
-        <w:br/>
-        <w:t>These findings align with studies emphasizing HTM’s biological plausibility for dynamic tasks (e.g., time-series prediction) but highlight scalability challenges. KNN’s limitations mirror broader issues in distance-based methods for high-dimensional data. Future work should explore hybrid models—combining HTM’s plasticity with KNN’s efficiency—and adaptive SP configurations (e.g., dynamic potential radii) to optimize reconstruction across scales.</w:t>
+        <w:t>prediction) but highlight scalability challenges. KNN’s limitations mirror broader issues in distance-based methods for high-dimensional data. Future work should explore hybrid models—combining HTM’s plasticity with KNN’s efficiency—and adaptive SP configurations (e.g., dynamic potential radii) to optimize reconstruction across scales.</w:t>
       </w:r>
     </w:p>
     <w:p>
@@ -6022,15 +7478,17 @@
           <w:spacing w:val="-1"/>
           <w:lang w:eastAsia="x-none"/>
         </w:rPr>
-        <w:t xml:space="preserve">KNN’s unexpected parity with HTM in mid-range inputs (25–35) introduces intriguing possibilities for hybrid architectures. While HTM excels in global pattern coherence, KNN’s localized accuracy hints at cascaded frameworks where HTM handles broad recognition and KNN refines specific predictions. Such models could balance biological plausibility with computational efficiency, particularly in edge computing scenarios. Additionally, the stark training-test performance gap across classifiers underscores overfitting risks in SDR-based systems. Regularization techniques, inspired by dropout in neural networks or entropy-based neighbor pruning, could </w:t>
-      </w:r>
-      <w:r>
+        <w:t>KNN’s unexpected parity with HTM in mid-range inputs (25–35) introduces intriguing possibilities for hybrid architectures. While HTM excels in global pattern coherence, KNN’s localized accuracy hints at cascaded frameworks where HTM handles broad recognition and KNN refines specific predictions. Such models could balance biological plausibility with computational efficiency, particularly in edge computing scenarios. Additionally, the stark training-test performance gap across classifiers underscores overfitting risks in SDR-based systems. Regularization techniques, inspired by dropout in neural networks or entropy-based neighbor pruning, could enhance robustness, ensuring reliability in dynamic environments.</w:t>
+      </w:r>
+    </w:p>
+    <w:p>
+      <w:pPr>
+        <w:jc w:val="both"/>
         <w:rPr>
           <w:spacing w:val="-1"/>
           <w:lang w:eastAsia="x-none"/>
         </w:rPr>
-        <w:t>enhance robustness, ensuring reliability in dynamic environments.</w:t>
-      </w:r>
+      </w:pPr>
     </w:p>
     <w:p>
       <w:pPr>
@@ -6040,21 +7498,20 @@
           <w:lang w:eastAsia="x-none"/>
         </w:rPr>
       </w:pPr>
-    </w:p>
-    <w:p>
-      <w:pPr>
-        <w:jc w:val="both"/>
+      <w:r>
         <w:rPr>
           <w:spacing w:val="-1"/>
           <w:lang w:eastAsia="x-none"/>
         </w:rPr>
-      </w:pPr>
+        <w:t xml:space="preserve">Finally, the study underscores HTM’s potential as a bridge between bio-inspired computation and practical machine </w:t>
+      </w:r>
       <w:r>
         <w:rPr>
           <w:spacing w:val="-1"/>
           <w:lang w:eastAsia="x-none"/>
         </w:rPr>
-        <w:t>Finally, the study underscores HTM’s potential as a bridge between bio-inspired computation and practical machine learning. By addressing adaptive parameterization, noise resilience, and encoder versatility, HTM networks could transcend controlled experiments, advancing applications from adaptive robotics to predictive maintenance. These pathways not only refine HTM’s theoretical framework but also expand its utility in an era increasingly reliant on adaptive, energy-efficient AI systems.</w:t>
+        <w:lastRenderedPageBreak/>
+        <w:t>learning. By addressing adaptive parameterization, noise resilience, and encoder versatility, HTM networks could transcend controlled experiments, advancing applications from adaptive robotics to predictive maintenance. These pathways not only refine HTM’s theoretical framework but also expand its utility in an era increasingly reliant on adaptive, energy-efficient AI systems.</w:t>
       </w:r>
     </w:p>
     <w:p>
@@ -6171,19 +7628,17 @@
     </w:p>
     <w:p>
       <w:pPr>
-        <w:jc w:val="both"/>
-        <w:rPr>
-          <w:spacing w:val="-1"/>
-          <w:lang w:eastAsia="x-none"/>
-        </w:rPr>
-      </w:pPr>
-    </w:p>
-    <w:p>
-      <w:pPr>
         <w:pStyle w:val="Heading1"/>
-      </w:pPr>
-      <w:r>
-        <w:lastRenderedPageBreak/>
+        <w:rPr>
+          <w:b/>
+          <w:bCs/>
+        </w:rPr>
+      </w:pPr>
+      <w:r>
+        <w:rPr>
+          <w:b/>
+          <w:bCs/>
+        </w:rPr>
         <w:t>References</w:t>
       </w:r>
     </w:p>
@@ -6244,7 +7699,7 @@
         </w:rPr>
         <w:t xml:space="preserve">, 23. </w:t>
       </w:r>
-      <w:hyperlink r:id="rId24" w:history="1">
+      <w:hyperlink r:id="rId36" w:history="1">
         <w:r>
           <w:rPr>
             <w:rStyle w:val="Hyperlink"/>
@@ -6306,7 +7761,7 @@
         </w:rPr>
         <w:t xml:space="preserve">, 111. </w:t>
       </w:r>
-      <w:hyperlink r:id="rId25" w:history="1">
+      <w:hyperlink r:id="rId37" w:history="1">
         <w:r>
           <w:rPr>
             <w:rStyle w:val="Hyperlink"/>
@@ -6368,7 +7823,7 @@
         </w:rPr>
         <w:t xml:space="preserve">(1), 21-27. </w:t>
       </w:r>
-      <w:hyperlink r:id="rId26" w:history="1">
+      <w:hyperlink r:id="rId38" w:history="1">
         <w:r>
           <w:rPr>
             <w:rStyle w:val="Hyperlink"/>
@@ -6398,6 +7853,7 @@
           <w:lang w:val="en-IN" w:eastAsia="x-none"/>
         </w:rPr>
       </w:pPr>
+      <w:proofErr w:type="spellStart"/>
       <w:r>
         <w:rPr>
           <w:rFonts w:ascii="Times New Roman" w:hAnsi="Times New Roman"/>
@@ -6406,9 +7862,42 @@
           <w:szCs w:val="20"/>
           <w:lang w:val="en-IN" w:eastAsia="x-none"/>
         </w:rPr>
-        <w:t xml:space="preserve">ScottPlot Library. (2023). ScottPlot: Interactive Plotting Library for .NET. Retrieved from </w:t>
-      </w:r>
-      <w:hyperlink r:id="rId27" w:tgtFrame="_new" w:history="1">
+        <w:t>ScottPlot</w:t>
+      </w:r>
+      <w:proofErr w:type="spellEnd"/>
+      <w:r>
+        <w:rPr>
+          <w:rFonts w:ascii="Times New Roman" w:hAnsi="Times New Roman"/>
+          <w:spacing w:val="-1"/>
+          <w:sz w:val="20"/>
+          <w:szCs w:val="20"/>
+          <w:lang w:val="en-IN" w:eastAsia="x-none"/>
+        </w:rPr>
+        <w:t xml:space="preserve"> Library. (2023). </w:t>
+      </w:r>
+      <w:proofErr w:type="spellStart"/>
+      <w:r>
+        <w:rPr>
+          <w:rFonts w:ascii="Times New Roman" w:hAnsi="Times New Roman"/>
+          <w:spacing w:val="-1"/>
+          <w:sz w:val="20"/>
+          <w:szCs w:val="20"/>
+          <w:lang w:val="en-IN" w:eastAsia="x-none"/>
+        </w:rPr>
+        <w:t>ScottPlot</w:t>
+      </w:r>
+      <w:proofErr w:type="spellEnd"/>
+      <w:r>
+        <w:rPr>
+          <w:rFonts w:ascii="Times New Roman" w:hAnsi="Times New Roman"/>
+          <w:spacing w:val="-1"/>
+          <w:sz w:val="20"/>
+          <w:szCs w:val="20"/>
+          <w:lang w:val="en-IN" w:eastAsia="x-none"/>
+        </w:rPr>
+        <w:t xml:space="preserve">: Interactive Plotting Library for .NET. Retrieved from </w:t>
+      </w:r>
+      <w:hyperlink r:id="rId39" w:tgtFrame="_new" w:history="1">
         <w:r>
           <w:rPr>
             <w:rStyle w:val="Hyperlink"/>
@@ -6487,6 +7976,7 @@
           <w:lang w:val="en-IN" w:eastAsia="x-none"/>
         </w:rPr>
       </w:pPr>
+      <w:proofErr w:type="spellStart"/>
       <w:r>
         <w:rPr>
           <w:rFonts w:ascii="Times New Roman" w:hAnsi="Times New Roman"/>
@@ -6495,7 +7985,62 @@
           <w:szCs w:val="20"/>
           <w:lang w:val="en-IN" w:eastAsia="x-none"/>
         </w:rPr>
-        <w:t xml:space="preserve">Mnatzaganian, J., Fokoué, E., &amp; Kudithipudi, D. (2017). A Mathematical Formalization of Hierarchical Temporal Memory’s Spatial Pooler. </w:t>
+        <w:t>Mnatzaganian</w:t>
+      </w:r>
+      <w:proofErr w:type="spellEnd"/>
+      <w:r>
+        <w:rPr>
+          <w:rFonts w:ascii="Times New Roman" w:hAnsi="Times New Roman"/>
+          <w:spacing w:val="-1"/>
+          <w:sz w:val="20"/>
+          <w:szCs w:val="20"/>
+          <w:lang w:val="en-IN" w:eastAsia="x-none"/>
+        </w:rPr>
+        <w:t xml:space="preserve">, J., </w:t>
+      </w:r>
+      <w:proofErr w:type="spellStart"/>
+      <w:r>
+        <w:rPr>
+          <w:rFonts w:ascii="Times New Roman" w:hAnsi="Times New Roman"/>
+          <w:spacing w:val="-1"/>
+          <w:sz w:val="20"/>
+          <w:szCs w:val="20"/>
+          <w:lang w:val="en-IN" w:eastAsia="x-none"/>
+        </w:rPr>
+        <w:t>Fokoué</w:t>
+      </w:r>
+      <w:proofErr w:type="spellEnd"/>
+      <w:r>
+        <w:rPr>
+          <w:rFonts w:ascii="Times New Roman" w:hAnsi="Times New Roman"/>
+          <w:spacing w:val="-1"/>
+          <w:sz w:val="20"/>
+          <w:szCs w:val="20"/>
+          <w:lang w:val="en-IN" w:eastAsia="x-none"/>
+        </w:rPr>
+        <w:t xml:space="preserve">, E., &amp; </w:t>
+      </w:r>
+      <w:proofErr w:type="spellStart"/>
+      <w:r>
+        <w:rPr>
+          <w:rFonts w:ascii="Times New Roman" w:hAnsi="Times New Roman"/>
+          <w:spacing w:val="-1"/>
+          <w:sz w:val="20"/>
+          <w:szCs w:val="20"/>
+          <w:lang w:val="en-IN" w:eastAsia="x-none"/>
+        </w:rPr>
+        <w:t>Kudithipudi</w:t>
+      </w:r>
+      <w:proofErr w:type="spellEnd"/>
+      <w:r>
+        <w:rPr>
+          <w:rFonts w:ascii="Times New Roman" w:hAnsi="Times New Roman"/>
+          <w:spacing w:val="-1"/>
+          <w:sz w:val="20"/>
+          <w:szCs w:val="20"/>
+          <w:lang w:val="en-IN" w:eastAsia="x-none"/>
+        </w:rPr>
+        <w:t xml:space="preserve">, D. (2017). A Mathematical Formalization of Hierarchical Temporal Memory’s Spatial Pooler. </w:t>
       </w:r>
       <w:r>
         <w:rPr>
@@ -6519,7 +8064,7 @@
         </w:rPr>
         <w:t xml:space="preserve">, 81. </w:t>
       </w:r>
-      <w:hyperlink r:id="rId28" w:history="1">
+      <w:hyperlink r:id="rId40" w:history="1">
         <w:r>
           <w:rPr>
             <w:rStyle w:val="Hyperlink"/>
@@ -6581,7 +8126,7 @@
         </w:rPr>
         <w:t xml:space="preserve">, 1-10. </w:t>
       </w:r>
-      <w:hyperlink r:id="rId29" w:history="1">
+      <w:hyperlink r:id="rId41" w:history="1">
         <w:r>
           <w:rPr>
             <w:rStyle w:val="Hyperlink"/>
@@ -6621,6 +8166,7 @@
         </w:rPr>
         <w:t xml:space="preserve">George, D., &amp; Hawkins, J. (2009). Towards a Mathematical Theory of Cortical Micro-circuits. </w:t>
       </w:r>
+      <w:proofErr w:type="spellStart"/>
       <w:r>
         <w:rPr>
           <w:rFonts w:ascii="Times New Roman" w:hAnsi="Times New Roman"/>
@@ -6631,19 +8177,32 @@
           <w:szCs w:val="20"/>
           <w:lang w:val="en-IN" w:eastAsia="x-none"/>
         </w:rPr>
-        <w:t>PLoS Computational Biology, 5</w:t>
-      </w:r>
-      <w:r>
-        <w:rPr>
-          <w:rFonts w:ascii="Times New Roman" w:hAnsi="Times New Roman"/>
+        <w:t>PLoS</w:t>
+      </w:r>
+      <w:proofErr w:type="spellEnd"/>
+      <w:r>
+        <w:rPr>
+          <w:rFonts w:ascii="Times New Roman" w:hAnsi="Times New Roman"/>
+          <w:i/>
+          <w:iCs/>
           <w:spacing w:val="-1"/>
           <w:sz w:val="20"/>
           <w:szCs w:val="20"/>
           <w:lang w:val="en-IN" w:eastAsia="x-none"/>
         </w:rPr>
+        <w:t xml:space="preserve"> Computational Biology, 5</w:t>
+      </w:r>
+      <w:r>
+        <w:rPr>
+          <w:rFonts w:ascii="Times New Roman" w:hAnsi="Times New Roman"/>
+          <w:spacing w:val="-1"/>
+          <w:sz w:val="20"/>
+          <w:szCs w:val="20"/>
+          <w:lang w:val="en-IN" w:eastAsia="x-none"/>
+        </w:rPr>
         <w:t xml:space="preserve">(10), e1000532. </w:t>
       </w:r>
-      <w:hyperlink r:id="rId30" w:history="1">
+      <w:hyperlink r:id="rId42" w:history="1">
         <w:r>
           <w:rPr>
             <w:rStyle w:val="Hyperlink"/>
@@ -6685,8 +8244,8 @@
       </w:pPr>
     </w:p>
     <w:sectPr>
-      <w:headerReference w:type="default" r:id="rId31"/>
-      <w:footerReference w:type="default" r:id="rId32"/>
+      <w:headerReference w:type="default" r:id="rId43"/>
+      <w:footerReference w:type="default" r:id="rId44"/>
       <w:type w:val="continuous"/>
       <w:pgSz w:w="11906" w:h="16838" w:code="9"/>
       <w:pgMar w:top="1080" w:right="907" w:bottom="1440" w:left="907" w:header="720" w:footer="720" w:gutter="0"/>
@@ -12755,6 +14314,15 @@
       <w:color w:val="666666"/>
     </w:rPr>
   </w:style>
+  <w:style w:type="paragraph" w:styleId="NormalWeb">
+    <w:name w:val="Normal (Web)"/>
+    <w:basedOn w:val="Normal"/>
+    <w:rsid w:val="00953383"/>
+    <w:rPr>
+      <w:sz w:val="24"/>
+      <w:szCs w:val="24"/>
+    </w:rPr>
+  </w:style>
 </w:styles>
 </file>
 

</xml_diff>